<commit_message>
docs: expand monster concept catalog to 100
</commit_message>
<xml_diff>
--- a/docs/The_Monster_Exchange_Initial_Monster_Catalog.docx
+++ b/docs/The_Monster_Exchange_Initial_Monster_Catalog.docx
@@ -12405,6 +12405,3294 @@
                 <w:sz w:val="17"/>
               </w:rPr>
               <w:t>A disciplined cave guardian with tuning-fork forearms. It reads vibrations through stone and counters attacks with precisely timed resonant strikes.</w:t>
+            </w:r>
+          </w:p>
+        </w:tc>
+      </w:tr>
+    </w:tbl>
+    <w:p>
+      <w:r>
+        <w:br w:type="page"/>
+      </w:r>
+    </w:p>
+    <w:p>
+      <w:pPr>
+        <w:pStyle w:val="Heading1"/>
+      </w:pPr>
+      <w:r>
+        <w:t>Roster Expansion - Concepts 81-100</w:t>
+      </w:r>
+    </w:p>
+    <w:p>
+      <w:pPr>
+        <w:spacing w:after="160"/>
+      </w:pPr>
+      <w:r>
+        <w:t>A compact third set covering every combat type, with no additional Legendary concept.</w:t>
+      </w:r>
+    </w:p>
+    <w:tbl>
+      <w:tblPr>
+        <w:tblStyle w:val="TableGrid"/>
+        <w:tblW w:type="dxa" w:w="9360"/>
+        <w:jc w:val="left"/>
+        <w:tblLayout w:type="fixed"/>
+        <w:tblLook w:firstColumn="1" w:firstRow="1" w:lastColumn="0" w:lastRow="0" w:noHBand="0" w:noVBand="1" w:val="04A0"/>
+        <w:tblInd w:w="120" w:type="dxa"/>
+      </w:tblPr>
+      <w:tblGrid>
+        <w:gridCol w:w="430"/>
+        <w:gridCol w:w="1500"/>
+        <w:gridCol w:w="1250"/>
+        <w:gridCol w:w="850"/>
+        <w:gridCol w:w="5330"/>
+      </w:tblGrid>
+      <w:tr>
+        <w:trPr>
+          <w:tblHeader w:val="true"/>
+        </w:trPr>
+        <w:tc>
+          <w:tcPr>
+            <w:tcW w:type="dxa" w:w="430"/>
+            <w:shd w:fill="E8EEF5"/>
+            <w:vAlign w:val="center"/>
+            <w:tcMar>
+              <w:top w:w="80" w:type="dxa"/>
+              <w:start w:w="120" w:type="dxa"/>
+              <w:bottom w:w="80" w:type="dxa"/>
+              <w:end w:w="120" w:type="dxa"/>
+            </w:tcMar>
+          </w:tcPr>
+          <w:p>
+            <w:pPr>
+              <w:spacing w:after="0"/>
+              <w:jc w:val="center"/>
+            </w:pPr>
+            <w:r>
+              <w:rPr>
+                <w:rFonts w:ascii="Calibri" w:hAnsi="Calibri"/>
+                <w:b/>
+                <w:i w:val="0"/>
+                <w:color w:val="163147"/>
+                <w:sz w:val="18"/>
+              </w:rPr>
+              <w:t>#</w:t>
+            </w:r>
+          </w:p>
+        </w:tc>
+        <w:tc>
+          <w:tcPr>
+            <w:tcW w:type="dxa" w:w="1500"/>
+            <w:shd w:fill="E8EEF5"/>
+            <w:vAlign w:val="center"/>
+            <w:tcMar>
+              <w:top w:w="80" w:type="dxa"/>
+              <w:start w:w="120" w:type="dxa"/>
+              <w:bottom w:w="80" w:type="dxa"/>
+              <w:end w:w="120" w:type="dxa"/>
+            </w:tcMar>
+          </w:tcPr>
+          <w:p>
+            <w:pPr>
+              <w:spacing w:after="0"/>
+              <w:jc w:val="center"/>
+            </w:pPr>
+            <w:r>
+              <w:rPr>
+                <w:rFonts w:ascii="Calibri" w:hAnsi="Calibri"/>
+                <w:b/>
+                <w:i w:val="0"/>
+                <w:color w:val="163147"/>
+                <w:sz w:val="18"/>
+              </w:rPr>
+              <w:t>Name / Line</w:t>
+            </w:r>
+          </w:p>
+        </w:tc>
+        <w:tc>
+          <w:tcPr>
+            <w:tcW w:type="dxa" w:w="1250"/>
+            <w:shd w:fill="E8EEF5"/>
+            <w:vAlign w:val="center"/>
+            <w:tcMar>
+              <w:top w:w="80" w:type="dxa"/>
+              <w:start w:w="120" w:type="dxa"/>
+              <w:bottom w:w="80" w:type="dxa"/>
+              <w:end w:w="120" w:type="dxa"/>
+            </w:tcMar>
+          </w:tcPr>
+          <w:p>
+            <w:pPr>
+              <w:spacing w:after="0"/>
+              <w:jc w:val="center"/>
+            </w:pPr>
+            <w:r>
+              <w:rPr>
+                <w:rFonts w:ascii="Calibri" w:hAnsi="Calibri"/>
+                <w:b/>
+                <w:i w:val="0"/>
+                <w:color w:val="163147"/>
+                <w:sz w:val="18"/>
+              </w:rPr>
+              <w:t>Type</w:t>
+            </w:r>
+          </w:p>
+        </w:tc>
+        <w:tc>
+          <w:tcPr>
+            <w:tcW w:type="dxa" w:w="850"/>
+            <w:shd w:fill="E8EEF5"/>
+            <w:vAlign w:val="center"/>
+            <w:tcMar>
+              <w:top w:w="80" w:type="dxa"/>
+              <w:start w:w="120" w:type="dxa"/>
+              <w:bottom w:w="80" w:type="dxa"/>
+              <w:end w:w="120" w:type="dxa"/>
+            </w:tcMar>
+          </w:tcPr>
+          <w:p>
+            <w:pPr>
+              <w:spacing w:after="0"/>
+              <w:jc w:val="center"/>
+            </w:pPr>
+            <w:r>
+              <w:rPr>
+                <w:rFonts w:ascii="Calibri" w:hAnsi="Calibri"/>
+                <w:b/>
+                <w:i w:val="0"/>
+                <w:color w:val="163147"/>
+                <w:sz w:val="18"/>
+              </w:rPr>
+              <w:t>Rarity</w:t>
+            </w:r>
+          </w:p>
+        </w:tc>
+        <w:tc>
+          <w:tcPr>
+            <w:tcW w:type="dxa" w:w="5330"/>
+            <w:shd w:fill="E8EEF5"/>
+            <w:vAlign w:val="center"/>
+            <w:tcMar>
+              <w:top w:w="80" w:type="dxa"/>
+              <w:start w:w="120" w:type="dxa"/>
+              <w:bottom w:w="80" w:type="dxa"/>
+              <w:end w:w="120" w:type="dxa"/>
+            </w:tcMar>
+          </w:tcPr>
+          <w:p>
+            <w:pPr>
+              <w:spacing w:after="0"/>
+              <w:jc w:val="left"/>
+            </w:pPr>
+            <w:r>
+              <w:rPr>
+                <w:rFonts w:ascii="Calibri" w:hAnsi="Calibri"/>
+                <w:b/>
+                <w:i w:val="0"/>
+                <w:color w:val="163147"/>
+                <w:sz w:val="18"/>
+              </w:rPr>
+              <w:t>Appearance and short description</w:t>
+            </w:r>
+          </w:p>
+        </w:tc>
+      </w:tr>
+      <w:tr>
+        <w:tc>
+          <w:tcPr>
+            <w:tcW w:type="dxa" w:w="430"/>
+            <w:vAlign w:val="center"/>
+            <w:tcMar>
+              <w:top w:w="80" w:type="dxa"/>
+              <w:start w:w="120" w:type="dxa"/>
+              <w:bottom w:w="80" w:type="dxa"/>
+              <w:end w:w="120" w:type="dxa"/>
+            </w:tcMar>
+          </w:tcPr>
+          <w:p>
+            <w:pPr>
+              <w:spacing w:after="0"/>
+              <w:jc w:val="center"/>
+            </w:pPr>
+            <w:r>
+              <w:rPr>
+                <w:rFonts w:ascii="Calibri" w:hAnsi="Calibri"/>
+                <w:b/>
+                <w:i w:val="0"/>
+                <w:color w:val="606973"/>
+                <w:sz w:val="18"/>
+              </w:rPr>
+              <w:t>81</w:t>
+            </w:r>
+          </w:p>
+        </w:tc>
+        <w:tc>
+          <w:tcPr>
+            <w:tcW w:type="dxa" w:w="1500"/>
+            <w:vAlign w:val="center"/>
+            <w:tcMar>
+              <w:top w:w="80" w:type="dxa"/>
+              <w:start w:w="120" w:type="dxa"/>
+              <w:bottom w:w="80" w:type="dxa"/>
+              <w:end w:w="120" w:type="dxa"/>
+            </w:tcMar>
+          </w:tcPr>
+          <w:p>
+            <w:pPr>
+              <w:spacing w:after="20"/>
+            </w:pPr>
+            <w:r>
+              <w:rPr>
+                <w:rFonts w:ascii="Calibri" w:hAnsi="Calibri"/>
+                <w:b/>
+                <w:i w:val="0"/>
+                <w:color w:val="163147"/>
+                <w:sz w:val="19"/>
+              </w:rPr>
+              <w:t>Quillop</w:t>
+            </w:r>
+          </w:p>
+          <w:p>
+            <w:pPr>
+              <w:spacing w:after="0"/>
+            </w:pPr>
+            <w:r>
+              <w:rPr>
+                <w:rFonts w:ascii="Calibri" w:hAnsi="Calibri"/>
+                <w:b w:val="0"/>
+                <w:i/>
+                <w:color w:val="606973"/>
+                <w:sz w:val="16"/>
+              </w:rPr>
+              <w:t>Stage 1 of 2</w:t>
+            </w:r>
+          </w:p>
+        </w:tc>
+        <w:tc>
+          <w:tcPr>
+            <w:tcW w:type="dxa" w:w="1250"/>
+            <w:vAlign w:val="center"/>
+            <w:tcMar>
+              <w:top w:w="80" w:type="dxa"/>
+              <w:start w:w="120" w:type="dxa"/>
+              <w:bottom w:w="80" w:type="dxa"/>
+              <w:end w:w="120" w:type="dxa"/>
+            </w:tcMar>
+          </w:tcPr>
+          <w:p>
+            <w:pPr>
+              <w:spacing w:after="0"/>
+              <w:jc w:val="center"/>
+            </w:pPr>
+            <w:r>
+              <w:rPr>
+                <w:rFonts w:ascii="Calibri" w:hAnsi="Calibri"/>
+                <w:b/>
+                <w:i w:val="0"/>
+                <w:color w:val="163147"/>
+                <w:sz w:val="17"/>
+              </w:rPr>
+              <w:t>Normal</w:t>
+            </w:r>
+          </w:p>
+        </w:tc>
+        <w:tc>
+          <w:tcPr>
+            <w:tcW w:type="dxa" w:w="850"/>
+            <w:vAlign w:val="center"/>
+            <w:tcMar>
+              <w:top w:w="80" w:type="dxa"/>
+              <w:start w:w="120" w:type="dxa"/>
+              <w:bottom w:w="80" w:type="dxa"/>
+              <w:end w:w="120" w:type="dxa"/>
+            </w:tcMar>
+          </w:tcPr>
+          <w:p>
+            <w:pPr>
+              <w:spacing w:after="0"/>
+              <w:jc w:val="center"/>
+            </w:pPr>
+            <w:r>
+              <w:rPr>
+                <w:rFonts w:ascii="Calibri" w:hAnsi="Calibri"/>
+                <w:b/>
+                <w:i w:val="0"/>
+                <w:color w:val="606973"/>
+                <w:sz w:val="17"/>
+              </w:rPr>
+              <w:t>Common</w:t>
+            </w:r>
+          </w:p>
+        </w:tc>
+        <w:tc>
+          <w:tcPr>
+            <w:tcW w:type="dxa" w:w="5330"/>
+            <w:vAlign w:val="center"/>
+            <w:tcMar>
+              <w:top w:w="80" w:type="dxa"/>
+              <w:start w:w="120" w:type="dxa"/>
+              <w:bottom w:w="80" w:type="dxa"/>
+              <w:end w:w="120" w:type="dxa"/>
+            </w:tcMar>
+          </w:tcPr>
+          <w:p>
+            <w:pPr>
+              <w:spacing w:after="0" w:line="259" w:lineRule="auto"/>
+            </w:pPr>
+            <w:r>
+              <w:rPr>
+                <w:rFonts w:ascii="Calibri" w:hAnsi="Calibri"/>
+                <w:b w:val="0"/>
+                <w:i w:val="0"/>
+                <w:color w:val="2D3237"/>
+                <w:sz w:val="17"/>
+              </w:rPr>
+              <w:t>A round grassland browser with flexible quills and an ink-dark nose. It arranges shed quills into simple markers around feeding grounds.</w:t>
+            </w:r>
+          </w:p>
+        </w:tc>
+      </w:tr>
+      <w:tr>
+        <w:tc>
+          <w:tcPr>
+            <w:tcW w:type="dxa" w:w="430"/>
+            <w:vAlign w:val="center"/>
+            <w:tcMar>
+              <w:top w:w="80" w:type="dxa"/>
+              <w:start w:w="120" w:type="dxa"/>
+              <w:bottom w:w="80" w:type="dxa"/>
+              <w:end w:w="120" w:type="dxa"/>
+            </w:tcMar>
+          </w:tcPr>
+          <w:p>
+            <w:pPr>
+              <w:spacing w:after="0"/>
+              <w:jc w:val="center"/>
+            </w:pPr>
+            <w:r>
+              <w:rPr>
+                <w:rFonts w:ascii="Calibri" w:hAnsi="Calibri"/>
+                <w:b/>
+                <w:i w:val="0"/>
+                <w:color w:val="606973"/>
+                <w:sz w:val="18"/>
+              </w:rPr>
+              <w:t>82</w:t>
+            </w:r>
+          </w:p>
+        </w:tc>
+        <w:tc>
+          <w:tcPr>
+            <w:tcW w:type="dxa" w:w="1500"/>
+            <w:vAlign w:val="center"/>
+            <w:tcMar>
+              <w:top w:w="80" w:type="dxa"/>
+              <w:start w:w="120" w:type="dxa"/>
+              <w:bottom w:w="80" w:type="dxa"/>
+              <w:end w:w="120" w:type="dxa"/>
+            </w:tcMar>
+          </w:tcPr>
+          <w:p>
+            <w:pPr>
+              <w:spacing w:after="20"/>
+            </w:pPr>
+            <w:r>
+              <w:rPr>
+                <w:rFonts w:ascii="Calibri" w:hAnsi="Calibri"/>
+                <w:b/>
+                <w:i w:val="0"/>
+                <w:color w:val="163147"/>
+                <w:sz w:val="19"/>
+              </w:rPr>
+              <w:t>Scribetail</w:t>
+            </w:r>
+          </w:p>
+          <w:p>
+            <w:pPr>
+              <w:spacing w:after="0"/>
+            </w:pPr>
+            <w:r>
+              <w:rPr>
+                <w:rFonts w:ascii="Calibri" w:hAnsi="Calibri"/>
+                <w:b w:val="0"/>
+                <w:i/>
+                <w:color w:val="606973"/>
+                <w:sz w:val="16"/>
+              </w:rPr>
+              <w:t>Stage 2 of 2</w:t>
+            </w:r>
+          </w:p>
+        </w:tc>
+        <w:tc>
+          <w:tcPr>
+            <w:tcW w:type="dxa" w:w="1250"/>
+            <w:vAlign w:val="center"/>
+            <w:tcMar>
+              <w:top w:w="80" w:type="dxa"/>
+              <w:start w:w="120" w:type="dxa"/>
+              <w:bottom w:w="80" w:type="dxa"/>
+              <w:end w:w="120" w:type="dxa"/>
+            </w:tcMar>
+          </w:tcPr>
+          <w:p>
+            <w:pPr>
+              <w:spacing w:after="0"/>
+              <w:jc w:val="center"/>
+            </w:pPr>
+            <w:r>
+              <w:rPr>
+                <w:rFonts w:ascii="Calibri" w:hAnsi="Calibri"/>
+                <w:b/>
+                <w:i w:val="0"/>
+                <w:color w:val="163147"/>
+                <w:sz w:val="17"/>
+              </w:rPr>
+              <w:t>Normal / Psychic</w:t>
+            </w:r>
+          </w:p>
+        </w:tc>
+        <w:tc>
+          <w:tcPr>
+            <w:tcW w:type="dxa" w:w="850"/>
+            <w:vAlign w:val="center"/>
+            <w:tcMar>
+              <w:top w:w="80" w:type="dxa"/>
+              <w:start w:w="120" w:type="dxa"/>
+              <w:bottom w:w="80" w:type="dxa"/>
+              <w:end w:w="120" w:type="dxa"/>
+            </w:tcMar>
+          </w:tcPr>
+          <w:p>
+            <w:pPr>
+              <w:spacing w:after="0"/>
+              <w:jc w:val="center"/>
+            </w:pPr>
+            <w:r>
+              <w:rPr>
+                <w:rFonts w:ascii="Calibri" w:hAnsi="Calibri"/>
+                <w:b/>
+                <w:i w:val="0"/>
+                <w:color w:val="606973"/>
+                <w:sz w:val="17"/>
+              </w:rPr>
+              <w:t>Uncommon</w:t>
+            </w:r>
+          </w:p>
+        </w:tc>
+        <w:tc>
+          <w:tcPr>
+            <w:tcW w:type="dxa" w:w="5330"/>
+            <w:vAlign w:val="center"/>
+            <w:tcMar>
+              <w:top w:w="80" w:type="dxa"/>
+              <w:start w:w="120" w:type="dxa"/>
+              <w:bottom w:w="80" w:type="dxa"/>
+              <w:end w:w="120" w:type="dxa"/>
+            </w:tcMar>
+          </w:tcPr>
+          <w:p>
+            <w:pPr>
+              <w:spacing w:after="0" w:line="259" w:lineRule="auto"/>
+            </w:pPr>
+            <w:r>
+              <w:rPr>
+                <w:rFonts w:ascii="Calibri" w:hAnsi="Calibri"/>
+                <w:b w:val="0"/>
+                <w:i w:val="0"/>
+                <w:color w:val="2D3237"/>
+                <w:sz w:val="17"/>
+              </w:rPr>
+              <w:t>A poised long-tailed creature whose quills move without being touched. It records remembered paths as precise patterns in soil and bark.</w:t>
+            </w:r>
+          </w:p>
+        </w:tc>
+      </w:tr>
+      <w:tr>
+        <w:tc>
+          <w:tcPr>
+            <w:tcW w:type="dxa" w:w="430"/>
+            <w:vAlign w:val="center"/>
+            <w:tcMar>
+              <w:top w:w="80" w:type="dxa"/>
+              <w:start w:w="120" w:type="dxa"/>
+              <w:bottom w:w="80" w:type="dxa"/>
+              <w:end w:w="120" w:type="dxa"/>
+            </w:tcMar>
+          </w:tcPr>
+          <w:p>
+            <w:pPr>
+              <w:spacing w:after="0"/>
+              <w:jc w:val="center"/>
+            </w:pPr>
+            <w:r>
+              <w:rPr>
+                <w:rFonts w:ascii="Calibri" w:hAnsi="Calibri"/>
+                <w:b/>
+                <w:i w:val="0"/>
+                <w:color w:val="606973"/>
+                <w:sz w:val="18"/>
+              </w:rPr>
+              <w:t>83</w:t>
+            </w:r>
+          </w:p>
+        </w:tc>
+        <w:tc>
+          <w:tcPr>
+            <w:tcW w:type="dxa" w:w="1500"/>
+            <w:vAlign w:val="center"/>
+            <w:tcMar>
+              <w:top w:w="80" w:type="dxa"/>
+              <w:start w:w="120" w:type="dxa"/>
+              <w:bottom w:w="80" w:type="dxa"/>
+              <w:end w:w="120" w:type="dxa"/>
+            </w:tcMar>
+          </w:tcPr>
+          <w:p>
+            <w:pPr>
+              <w:spacing w:after="20"/>
+            </w:pPr>
+            <w:r>
+              <w:rPr>
+                <w:rFonts w:ascii="Calibri" w:hAnsi="Calibri"/>
+                <w:b/>
+                <w:i w:val="0"/>
+                <w:color w:val="163147"/>
+                <w:sz w:val="19"/>
+              </w:rPr>
+              <w:t>Brinibble</w:t>
+            </w:r>
+          </w:p>
+          <w:p>
+            <w:pPr>
+              <w:spacing w:after="0"/>
+            </w:pPr>
+            <w:r>
+              <w:rPr>
+                <w:rFonts w:ascii="Calibri" w:hAnsi="Calibri"/>
+                <w:b w:val="0"/>
+                <w:i/>
+                <w:color w:val="606973"/>
+                <w:sz w:val="16"/>
+              </w:rPr>
+              <w:t>Stage 1 of 2</w:t>
+            </w:r>
+          </w:p>
+        </w:tc>
+        <w:tc>
+          <w:tcPr>
+            <w:tcW w:type="dxa" w:w="1250"/>
+            <w:vAlign w:val="center"/>
+            <w:tcMar>
+              <w:top w:w="80" w:type="dxa"/>
+              <w:start w:w="120" w:type="dxa"/>
+              <w:bottom w:w="80" w:type="dxa"/>
+              <w:end w:w="120" w:type="dxa"/>
+            </w:tcMar>
+          </w:tcPr>
+          <w:p>
+            <w:pPr>
+              <w:spacing w:after="0"/>
+              <w:jc w:val="center"/>
+            </w:pPr>
+            <w:r>
+              <w:rPr>
+                <w:rFonts w:ascii="Calibri" w:hAnsi="Calibri"/>
+                <w:b/>
+                <w:i w:val="0"/>
+                <w:color w:val="163147"/>
+                <w:sz w:val="17"/>
+              </w:rPr>
+              <w:t>Water</w:t>
+            </w:r>
+          </w:p>
+        </w:tc>
+        <w:tc>
+          <w:tcPr>
+            <w:tcW w:type="dxa" w:w="850"/>
+            <w:vAlign w:val="center"/>
+            <w:tcMar>
+              <w:top w:w="80" w:type="dxa"/>
+              <w:start w:w="120" w:type="dxa"/>
+              <w:bottom w:w="80" w:type="dxa"/>
+              <w:end w:w="120" w:type="dxa"/>
+            </w:tcMar>
+          </w:tcPr>
+          <w:p>
+            <w:pPr>
+              <w:spacing w:after="0"/>
+              <w:jc w:val="center"/>
+            </w:pPr>
+            <w:r>
+              <w:rPr>
+                <w:rFonts w:ascii="Calibri" w:hAnsi="Calibri"/>
+                <w:b/>
+                <w:i w:val="0"/>
+                <w:color w:val="606973"/>
+                <w:sz w:val="17"/>
+              </w:rPr>
+              <w:t>Common</w:t>
+            </w:r>
+          </w:p>
+        </w:tc>
+        <w:tc>
+          <w:tcPr>
+            <w:tcW w:type="dxa" w:w="5330"/>
+            <w:vAlign w:val="center"/>
+            <w:tcMar>
+              <w:top w:w="80" w:type="dxa"/>
+              <w:start w:w="120" w:type="dxa"/>
+              <w:bottom w:w="80" w:type="dxa"/>
+              <w:end w:w="120" w:type="dxa"/>
+            </w:tcMar>
+          </w:tcPr>
+          <w:p>
+            <w:pPr>
+              <w:spacing w:after="0" w:line="259" w:lineRule="auto"/>
+            </w:pPr>
+            <w:r>
+              <w:rPr>
+                <w:rFonts w:ascii="Calibri" w:hAnsi="Calibri"/>
+                <w:b w:val="0"/>
+                <w:i w:val="0"/>
+                <w:color w:val="2D3237"/>
+                <w:sz w:val="17"/>
+              </w:rPr>
+              <w:t>A tiny shore-dweller inside a cork-like shell. It filters salt crystals from tide pools and stores fresh water for dry periods.</w:t>
+            </w:r>
+          </w:p>
+        </w:tc>
+      </w:tr>
+      <w:tr>
+        <w:tc>
+          <w:tcPr>
+            <w:tcW w:type="dxa" w:w="430"/>
+            <w:vAlign w:val="center"/>
+            <w:tcMar>
+              <w:top w:w="80" w:type="dxa"/>
+              <w:start w:w="120" w:type="dxa"/>
+              <w:bottom w:w="80" w:type="dxa"/>
+              <w:end w:w="120" w:type="dxa"/>
+            </w:tcMar>
+          </w:tcPr>
+          <w:p>
+            <w:pPr>
+              <w:spacing w:after="0"/>
+              <w:jc w:val="center"/>
+            </w:pPr>
+            <w:r>
+              <w:rPr>
+                <w:rFonts w:ascii="Calibri" w:hAnsi="Calibri"/>
+                <w:b/>
+                <w:i w:val="0"/>
+                <w:color w:val="606973"/>
+                <w:sz w:val="18"/>
+              </w:rPr>
+              <w:t>84</w:t>
+            </w:r>
+          </w:p>
+        </w:tc>
+        <w:tc>
+          <w:tcPr>
+            <w:tcW w:type="dxa" w:w="1500"/>
+            <w:vAlign w:val="center"/>
+            <w:tcMar>
+              <w:top w:w="80" w:type="dxa"/>
+              <w:start w:w="120" w:type="dxa"/>
+              <w:bottom w:w="80" w:type="dxa"/>
+              <w:end w:w="120" w:type="dxa"/>
+            </w:tcMar>
+          </w:tcPr>
+          <w:p>
+            <w:pPr>
+              <w:spacing w:after="20"/>
+            </w:pPr>
+            <w:r>
+              <w:rPr>
+                <w:rFonts w:ascii="Calibri" w:hAnsi="Calibri"/>
+                <w:b/>
+                <w:i w:val="0"/>
+                <w:color w:val="163147"/>
+                <w:sz w:val="19"/>
+              </w:rPr>
+              <w:t>Steamvat</w:t>
+            </w:r>
+          </w:p>
+          <w:p>
+            <w:pPr>
+              <w:spacing w:after="0"/>
+            </w:pPr>
+            <w:r>
+              <w:rPr>
+                <w:rFonts w:ascii="Calibri" w:hAnsi="Calibri"/>
+                <w:b w:val="0"/>
+                <w:i/>
+                <w:color w:val="606973"/>
+                <w:sz w:val="16"/>
+              </w:rPr>
+              <w:t>Stage 2 of 2</w:t>
+            </w:r>
+          </w:p>
+        </w:tc>
+        <w:tc>
+          <w:tcPr>
+            <w:tcW w:type="dxa" w:w="1250"/>
+            <w:vAlign w:val="center"/>
+            <w:tcMar>
+              <w:top w:w="80" w:type="dxa"/>
+              <w:start w:w="120" w:type="dxa"/>
+              <w:bottom w:w="80" w:type="dxa"/>
+              <w:end w:w="120" w:type="dxa"/>
+            </w:tcMar>
+          </w:tcPr>
+          <w:p>
+            <w:pPr>
+              <w:spacing w:after="0"/>
+              <w:jc w:val="center"/>
+            </w:pPr>
+            <w:r>
+              <w:rPr>
+                <w:rFonts w:ascii="Calibri" w:hAnsi="Calibri"/>
+                <w:b/>
+                <w:i w:val="0"/>
+                <w:color w:val="163147"/>
+                <w:sz w:val="17"/>
+              </w:rPr>
+              <w:t>Water / Fire</w:t>
+            </w:r>
+          </w:p>
+        </w:tc>
+        <w:tc>
+          <w:tcPr>
+            <w:tcW w:type="dxa" w:w="850"/>
+            <w:vAlign w:val="center"/>
+            <w:tcMar>
+              <w:top w:w="80" w:type="dxa"/>
+              <w:start w:w="120" w:type="dxa"/>
+              <w:bottom w:w="80" w:type="dxa"/>
+              <w:end w:w="120" w:type="dxa"/>
+            </w:tcMar>
+          </w:tcPr>
+          <w:p>
+            <w:pPr>
+              <w:spacing w:after="0"/>
+              <w:jc w:val="center"/>
+            </w:pPr>
+            <w:r>
+              <w:rPr>
+                <w:rFonts w:ascii="Calibri" w:hAnsi="Calibri"/>
+                <w:b/>
+                <w:i w:val="0"/>
+                <w:color w:val="606973"/>
+                <w:sz w:val="17"/>
+              </w:rPr>
+              <w:t>Uncommon</w:t>
+            </w:r>
+          </w:p>
+        </w:tc>
+        <w:tc>
+          <w:tcPr>
+            <w:tcW w:type="dxa" w:w="5330"/>
+            <w:vAlign w:val="center"/>
+            <w:tcMar>
+              <w:top w:w="80" w:type="dxa"/>
+              <w:start w:w="120" w:type="dxa"/>
+              <w:bottom w:w="80" w:type="dxa"/>
+              <w:end w:w="120" w:type="dxa"/>
+            </w:tcMar>
+          </w:tcPr>
+          <w:p>
+            <w:pPr>
+              <w:spacing w:after="0" w:line="259" w:lineRule="auto"/>
+            </w:pPr>
+            <w:r>
+              <w:rPr>
+                <w:rFonts w:ascii="Calibri" w:hAnsi="Calibri"/>
+                <w:b w:val="0"/>
+                <w:i w:val="0"/>
+                <w:color w:val="2D3237"/>
+                <w:sz w:val="17"/>
+              </w:rPr>
+              <w:t>A barrel-bodied coastal creature with copper vents and a sealed inner reservoir. It releases controlled steam clouds to shelter smaller monsters.</w:t>
+            </w:r>
+          </w:p>
+        </w:tc>
+      </w:tr>
+      <w:tr>
+        <w:tc>
+          <w:tcPr>
+            <w:tcW w:type="dxa" w:w="430"/>
+            <w:vAlign w:val="center"/>
+            <w:tcMar>
+              <w:top w:w="80" w:type="dxa"/>
+              <w:start w:w="120" w:type="dxa"/>
+              <w:bottom w:w="80" w:type="dxa"/>
+              <w:end w:w="120" w:type="dxa"/>
+            </w:tcMar>
+          </w:tcPr>
+          <w:p>
+            <w:pPr>
+              <w:spacing w:after="0"/>
+              <w:jc w:val="center"/>
+            </w:pPr>
+            <w:r>
+              <w:rPr>
+                <w:rFonts w:ascii="Calibri" w:hAnsi="Calibri"/>
+                <w:b/>
+                <w:i w:val="0"/>
+                <w:color w:val="606973"/>
+                <w:sz w:val="18"/>
+              </w:rPr>
+              <w:t>85</w:t>
+            </w:r>
+          </w:p>
+        </w:tc>
+        <w:tc>
+          <w:tcPr>
+            <w:tcW w:type="dxa" w:w="1500"/>
+            <w:vAlign w:val="center"/>
+            <w:tcMar>
+              <w:top w:w="80" w:type="dxa"/>
+              <w:start w:w="120" w:type="dxa"/>
+              <w:bottom w:w="80" w:type="dxa"/>
+              <w:end w:w="120" w:type="dxa"/>
+            </w:tcMar>
+          </w:tcPr>
+          <w:p>
+            <w:pPr>
+              <w:spacing w:after="20"/>
+            </w:pPr>
+            <w:r>
+              <w:rPr>
+                <w:rFonts w:ascii="Calibri" w:hAnsi="Calibri"/>
+                <w:b/>
+                <w:i w:val="0"/>
+                <w:color w:val="163147"/>
+                <w:sz w:val="19"/>
+              </w:rPr>
+              <w:t>Frondle</w:t>
+            </w:r>
+          </w:p>
+          <w:p>
+            <w:pPr>
+              <w:spacing w:after="0"/>
+            </w:pPr>
+            <w:r>
+              <w:rPr>
+                <w:rFonts w:ascii="Calibri" w:hAnsi="Calibri"/>
+                <w:b w:val="0"/>
+                <w:i/>
+                <w:color w:val="606973"/>
+                <w:sz w:val="16"/>
+              </w:rPr>
+              <w:t>Stage 1 of 2</w:t>
+            </w:r>
+          </w:p>
+        </w:tc>
+        <w:tc>
+          <w:tcPr>
+            <w:tcW w:type="dxa" w:w="1250"/>
+            <w:vAlign w:val="center"/>
+            <w:tcMar>
+              <w:top w:w="80" w:type="dxa"/>
+              <w:start w:w="120" w:type="dxa"/>
+              <w:bottom w:w="80" w:type="dxa"/>
+              <w:end w:w="120" w:type="dxa"/>
+            </w:tcMar>
+          </w:tcPr>
+          <w:p>
+            <w:pPr>
+              <w:spacing w:after="0"/>
+              <w:jc w:val="center"/>
+            </w:pPr>
+            <w:r>
+              <w:rPr>
+                <w:rFonts w:ascii="Calibri" w:hAnsi="Calibri"/>
+                <w:b/>
+                <w:i w:val="0"/>
+                <w:color w:val="163147"/>
+                <w:sz w:val="17"/>
+              </w:rPr>
+              <w:t>Grass / Bug</w:t>
+            </w:r>
+          </w:p>
+        </w:tc>
+        <w:tc>
+          <w:tcPr>
+            <w:tcW w:type="dxa" w:w="850"/>
+            <w:vAlign w:val="center"/>
+            <w:tcMar>
+              <w:top w:w="80" w:type="dxa"/>
+              <w:start w:w="120" w:type="dxa"/>
+              <w:bottom w:w="80" w:type="dxa"/>
+              <w:end w:w="120" w:type="dxa"/>
+            </w:tcMar>
+          </w:tcPr>
+          <w:p>
+            <w:pPr>
+              <w:spacing w:after="0"/>
+              <w:jc w:val="center"/>
+            </w:pPr>
+            <w:r>
+              <w:rPr>
+                <w:rFonts w:ascii="Calibri" w:hAnsi="Calibri"/>
+                <w:b/>
+                <w:i w:val="0"/>
+                <w:color w:val="606973"/>
+                <w:sz w:val="17"/>
+              </w:rPr>
+              <w:t>Common</w:t>
+            </w:r>
+          </w:p>
+        </w:tc>
+        <w:tc>
+          <w:tcPr>
+            <w:tcW w:type="dxa" w:w="5330"/>
+            <w:vAlign w:val="center"/>
+            <w:tcMar>
+              <w:top w:w="80" w:type="dxa"/>
+              <w:start w:w="120" w:type="dxa"/>
+              <w:bottom w:w="80" w:type="dxa"/>
+              <w:end w:w="120" w:type="dxa"/>
+            </w:tcMar>
+          </w:tcPr>
+          <w:p>
+            <w:pPr>
+              <w:spacing w:after="0" w:line="259" w:lineRule="auto"/>
+            </w:pPr>
+            <w:r>
+              <w:rPr>
+                <w:rFonts w:ascii="Calibri" w:hAnsi="Calibri"/>
+                <w:b w:val="0"/>
+                <w:i w:val="0"/>
+                <w:color w:val="2D3237"/>
+                <w:sz w:val="17"/>
+              </w:rPr>
+              <w:t>A leaf-folding insect with twiglike legs and a curious face. It repairs damaged foliage by stitching edges together with plant fiber.</w:t>
+            </w:r>
+          </w:p>
+        </w:tc>
+      </w:tr>
+      <w:tr>
+        <w:tc>
+          <w:tcPr>
+            <w:tcW w:type="dxa" w:w="430"/>
+            <w:vAlign w:val="center"/>
+            <w:tcMar>
+              <w:top w:w="80" w:type="dxa"/>
+              <w:start w:w="120" w:type="dxa"/>
+              <w:bottom w:w="80" w:type="dxa"/>
+              <w:end w:w="120" w:type="dxa"/>
+            </w:tcMar>
+          </w:tcPr>
+          <w:p>
+            <w:pPr>
+              <w:spacing w:after="0"/>
+              <w:jc w:val="center"/>
+            </w:pPr>
+            <w:r>
+              <w:rPr>
+                <w:rFonts w:ascii="Calibri" w:hAnsi="Calibri"/>
+                <w:b/>
+                <w:i w:val="0"/>
+                <w:color w:val="606973"/>
+                <w:sz w:val="18"/>
+              </w:rPr>
+              <w:t>86</w:t>
+            </w:r>
+          </w:p>
+        </w:tc>
+        <w:tc>
+          <w:tcPr>
+            <w:tcW w:type="dxa" w:w="1500"/>
+            <w:vAlign w:val="center"/>
+            <w:tcMar>
+              <w:top w:w="80" w:type="dxa"/>
+              <w:start w:w="120" w:type="dxa"/>
+              <w:bottom w:w="80" w:type="dxa"/>
+              <w:end w:w="120" w:type="dxa"/>
+            </w:tcMar>
+          </w:tcPr>
+          <w:p>
+            <w:pPr>
+              <w:spacing w:after="20"/>
+            </w:pPr>
+            <w:r>
+              <w:rPr>
+                <w:rFonts w:ascii="Calibri" w:hAnsi="Calibri"/>
+                <w:b/>
+                <w:i w:val="0"/>
+                <w:color w:val="163147"/>
+                <w:sz w:val="19"/>
+              </w:rPr>
+              <w:t>Thornloom</w:t>
+            </w:r>
+          </w:p>
+          <w:p>
+            <w:pPr>
+              <w:spacing w:after="0"/>
+            </w:pPr>
+            <w:r>
+              <w:rPr>
+                <w:rFonts w:ascii="Calibri" w:hAnsi="Calibri"/>
+                <w:b w:val="0"/>
+                <w:i/>
+                <w:color w:val="606973"/>
+                <w:sz w:val="16"/>
+              </w:rPr>
+              <w:t>Stage 2 of 2</w:t>
+            </w:r>
+          </w:p>
+        </w:tc>
+        <w:tc>
+          <w:tcPr>
+            <w:tcW w:type="dxa" w:w="1250"/>
+            <w:vAlign w:val="center"/>
+            <w:tcMar>
+              <w:top w:w="80" w:type="dxa"/>
+              <w:start w:w="120" w:type="dxa"/>
+              <w:bottom w:w="80" w:type="dxa"/>
+              <w:end w:w="120" w:type="dxa"/>
+            </w:tcMar>
+          </w:tcPr>
+          <w:p>
+            <w:pPr>
+              <w:spacing w:after="0"/>
+              <w:jc w:val="center"/>
+            </w:pPr>
+            <w:r>
+              <w:rPr>
+                <w:rFonts w:ascii="Calibri" w:hAnsi="Calibri"/>
+                <w:b/>
+                <w:i w:val="0"/>
+                <w:color w:val="163147"/>
+                <w:sz w:val="17"/>
+              </w:rPr>
+              <w:t>Grass / Bug</w:t>
+            </w:r>
+          </w:p>
+        </w:tc>
+        <w:tc>
+          <w:tcPr>
+            <w:tcW w:type="dxa" w:w="850"/>
+            <w:vAlign w:val="center"/>
+            <w:tcMar>
+              <w:top w:w="80" w:type="dxa"/>
+              <w:start w:w="120" w:type="dxa"/>
+              <w:bottom w:w="80" w:type="dxa"/>
+              <w:end w:w="120" w:type="dxa"/>
+            </w:tcMar>
+          </w:tcPr>
+          <w:p>
+            <w:pPr>
+              <w:spacing w:after="0"/>
+              <w:jc w:val="center"/>
+            </w:pPr>
+            <w:r>
+              <w:rPr>
+                <w:rFonts w:ascii="Calibri" w:hAnsi="Calibri"/>
+                <w:b/>
+                <w:i w:val="0"/>
+                <w:color w:val="606973"/>
+                <w:sz w:val="17"/>
+              </w:rPr>
+              <w:t>Uncommon</w:t>
+            </w:r>
+          </w:p>
+        </w:tc>
+        <w:tc>
+          <w:tcPr>
+            <w:tcW w:type="dxa" w:w="5330"/>
+            <w:vAlign w:val="center"/>
+            <w:tcMar>
+              <w:top w:w="80" w:type="dxa"/>
+              <w:start w:w="120" w:type="dxa"/>
+              <w:bottom w:w="80" w:type="dxa"/>
+              <w:end w:w="120" w:type="dxa"/>
+            </w:tcMar>
+          </w:tcPr>
+          <w:p>
+            <w:pPr>
+              <w:spacing w:after="0" w:line="259" w:lineRule="auto"/>
+            </w:pPr>
+            <w:r>
+              <w:rPr>
+                <w:rFonts w:ascii="Calibri" w:hAnsi="Calibri"/>
+                <w:b w:val="0"/>
+                <w:i w:val="0"/>
+                <w:color w:val="2D3237"/>
+                <w:sz w:val="17"/>
+              </w:rPr>
+              <w:t>A tall weaving insect carrying a spindle of living thorn-vine. Its elaborate nest walls become safe nurseries for many forest species.</w:t>
+            </w:r>
+          </w:p>
+        </w:tc>
+      </w:tr>
+      <w:tr>
+        <w:tc>
+          <w:tcPr>
+            <w:tcW w:type="dxa" w:w="430"/>
+            <w:vAlign w:val="center"/>
+            <w:tcMar>
+              <w:top w:w="80" w:type="dxa"/>
+              <w:start w:w="120" w:type="dxa"/>
+              <w:bottom w:w="80" w:type="dxa"/>
+              <w:end w:w="120" w:type="dxa"/>
+            </w:tcMar>
+          </w:tcPr>
+          <w:p>
+            <w:pPr>
+              <w:spacing w:after="0"/>
+              <w:jc w:val="center"/>
+            </w:pPr>
+            <w:r>
+              <w:rPr>
+                <w:rFonts w:ascii="Calibri" w:hAnsi="Calibri"/>
+                <w:b/>
+                <w:i w:val="0"/>
+                <w:color w:val="606973"/>
+                <w:sz w:val="18"/>
+              </w:rPr>
+              <w:t>87</w:t>
+            </w:r>
+          </w:p>
+        </w:tc>
+        <w:tc>
+          <w:tcPr>
+            <w:tcW w:type="dxa" w:w="1500"/>
+            <w:vAlign w:val="center"/>
+            <w:tcMar>
+              <w:top w:w="80" w:type="dxa"/>
+              <w:start w:w="120" w:type="dxa"/>
+              <w:bottom w:w="80" w:type="dxa"/>
+              <w:end w:w="120" w:type="dxa"/>
+            </w:tcMar>
+          </w:tcPr>
+          <w:p>
+            <w:pPr>
+              <w:spacing w:after="20"/>
+            </w:pPr>
+            <w:r>
+              <w:rPr>
+                <w:rFonts w:ascii="Calibri" w:hAnsi="Calibri"/>
+                <w:b/>
+                <w:i w:val="0"/>
+                <w:color w:val="163147"/>
+                <w:sz w:val="19"/>
+              </w:rPr>
+              <w:t>Gravvel</w:t>
+            </w:r>
+          </w:p>
+          <w:p>
+            <w:pPr>
+              <w:spacing w:after="0"/>
+            </w:pPr>
+            <w:r>
+              <w:rPr>
+                <w:rFonts w:ascii="Calibri" w:hAnsi="Calibri"/>
+                <w:b w:val="0"/>
+                <w:i/>
+                <w:color w:val="606973"/>
+                <w:sz w:val="16"/>
+              </w:rPr>
+              <w:t>Stage 1 of 2</w:t>
+            </w:r>
+          </w:p>
+        </w:tc>
+        <w:tc>
+          <w:tcPr>
+            <w:tcW w:type="dxa" w:w="1250"/>
+            <w:vAlign w:val="center"/>
+            <w:tcMar>
+              <w:top w:w="80" w:type="dxa"/>
+              <w:start w:w="120" w:type="dxa"/>
+              <w:bottom w:w="80" w:type="dxa"/>
+              <w:end w:w="120" w:type="dxa"/>
+            </w:tcMar>
+          </w:tcPr>
+          <w:p>
+            <w:pPr>
+              <w:spacing w:after="0"/>
+              <w:jc w:val="center"/>
+            </w:pPr>
+            <w:r>
+              <w:rPr>
+                <w:rFonts w:ascii="Calibri" w:hAnsi="Calibri"/>
+                <w:b/>
+                <w:i w:val="0"/>
+                <w:color w:val="163147"/>
+                <w:sz w:val="17"/>
+              </w:rPr>
+              <w:t>Rock / Ground</w:t>
+            </w:r>
+          </w:p>
+        </w:tc>
+        <w:tc>
+          <w:tcPr>
+            <w:tcW w:type="dxa" w:w="850"/>
+            <w:vAlign w:val="center"/>
+            <w:tcMar>
+              <w:top w:w="80" w:type="dxa"/>
+              <w:start w:w="120" w:type="dxa"/>
+              <w:bottom w:w="80" w:type="dxa"/>
+              <w:end w:w="120" w:type="dxa"/>
+            </w:tcMar>
+          </w:tcPr>
+          <w:p>
+            <w:pPr>
+              <w:spacing w:after="0"/>
+              <w:jc w:val="center"/>
+            </w:pPr>
+            <w:r>
+              <w:rPr>
+                <w:rFonts w:ascii="Calibri" w:hAnsi="Calibri"/>
+                <w:b/>
+                <w:i w:val="0"/>
+                <w:color w:val="606973"/>
+                <w:sz w:val="17"/>
+              </w:rPr>
+              <w:t>Common</w:t>
+            </w:r>
+          </w:p>
+        </w:tc>
+        <w:tc>
+          <w:tcPr>
+            <w:tcW w:type="dxa" w:w="5330"/>
+            <w:vAlign w:val="center"/>
+            <w:tcMar>
+              <w:top w:w="80" w:type="dxa"/>
+              <w:start w:w="120" w:type="dxa"/>
+              <w:bottom w:w="80" w:type="dxa"/>
+              <w:end w:w="120" w:type="dxa"/>
+            </w:tcMar>
+          </w:tcPr>
+          <w:p>
+            <w:pPr>
+              <w:spacing w:after="0" w:line="259" w:lineRule="auto"/>
+            </w:pPr>
+            <w:r>
+              <w:rPr>
+                <w:rFonts w:ascii="Calibri" w:hAnsi="Calibri"/>
+                <w:b w:val="0"/>
+                <w:i w:val="0"/>
+                <w:color w:val="2D3237"/>
+                <w:sz w:val="17"/>
+              </w:rPr>
+              <w:t>A low rocky burrower with a gravity-heavy belly and tiny digging claws. Loose stones settle into stable paths wherever it sleeps.</w:t>
+            </w:r>
+          </w:p>
+        </w:tc>
+      </w:tr>
+      <w:tr>
+        <w:tc>
+          <w:tcPr>
+            <w:tcW w:type="dxa" w:w="430"/>
+            <w:vAlign w:val="center"/>
+            <w:tcMar>
+              <w:top w:w="80" w:type="dxa"/>
+              <w:start w:w="120" w:type="dxa"/>
+              <w:bottom w:w="80" w:type="dxa"/>
+              <w:end w:w="120" w:type="dxa"/>
+            </w:tcMar>
+          </w:tcPr>
+          <w:p>
+            <w:pPr>
+              <w:spacing w:after="0"/>
+              <w:jc w:val="center"/>
+            </w:pPr>
+            <w:r>
+              <w:rPr>
+                <w:rFonts w:ascii="Calibri" w:hAnsi="Calibri"/>
+                <w:b/>
+                <w:i w:val="0"/>
+                <w:color w:val="606973"/>
+                <w:sz w:val="18"/>
+              </w:rPr>
+              <w:t>88</w:t>
+            </w:r>
+          </w:p>
+        </w:tc>
+        <w:tc>
+          <w:tcPr>
+            <w:tcW w:type="dxa" w:w="1500"/>
+            <w:vAlign w:val="center"/>
+            <w:tcMar>
+              <w:top w:w="80" w:type="dxa"/>
+              <w:start w:w="120" w:type="dxa"/>
+              <w:bottom w:w="80" w:type="dxa"/>
+              <w:end w:w="120" w:type="dxa"/>
+            </w:tcMar>
+          </w:tcPr>
+          <w:p>
+            <w:pPr>
+              <w:spacing w:after="20"/>
+            </w:pPr>
+            <w:r>
+              <w:rPr>
+                <w:rFonts w:ascii="Calibri" w:hAnsi="Calibri"/>
+                <w:b/>
+                <w:i w:val="0"/>
+                <w:color w:val="163147"/>
+                <w:sz w:val="19"/>
+              </w:rPr>
+              <w:t>Faultusk</w:t>
+            </w:r>
+          </w:p>
+          <w:p>
+            <w:pPr>
+              <w:spacing w:after="0"/>
+            </w:pPr>
+            <w:r>
+              <w:rPr>
+                <w:rFonts w:ascii="Calibri" w:hAnsi="Calibri"/>
+                <w:b w:val="0"/>
+                <w:i/>
+                <w:color w:val="606973"/>
+                <w:sz w:val="16"/>
+              </w:rPr>
+              <w:t>Stage 2 of 2</w:t>
+            </w:r>
+          </w:p>
+        </w:tc>
+        <w:tc>
+          <w:tcPr>
+            <w:tcW w:type="dxa" w:w="1250"/>
+            <w:vAlign w:val="center"/>
+            <w:tcMar>
+              <w:top w:w="80" w:type="dxa"/>
+              <w:start w:w="120" w:type="dxa"/>
+              <w:bottom w:w="80" w:type="dxa"/>
+              <w:end w:w="120" w:type="dxa"/>
+            </w:tcMar>
+          </w:tcPr>
+          <w:p>
+            <w:pPr>
+              <w:spacing w:after="0"/>
+              <w:jc w:val="center"/>
+            </w:pPr>
+            <w:r>
+              <w:rPr>
+                <w:rFonts w:ascii="Calibri" w:hAnsi="Calibri"/>
+                <w:b/>
+                <w:i w:val="0"/>
+                <w:color w:val="163147"/>
+                <w:sz w:val="17"/>
+              </w:rPr>
+              <w:t>Rock / Ground</w:t>
+            </w:r>
+          </w:p>
+        </w:tc>
+        <w:tc>
+          <w:tcPr>
+            <w:tcW w:type="dxa" w:w="850"/>
+            <w:vAlign w:val="center"/>
+            <w:tcMar>
+              <w:top w:w="80" w:type="dxa"/>
+              <w:start w:w="120" w:type="dxa"/>
+              <w:bottom w:w="80" w:type="dxa"/>
+              <w:end w:w="120" w:type="dxa"/>
+            </w:tcMar>
+          </w:tcPr>
+          <w:p>
+            <w:pPr>
+              <w:spacing w:after="0"/>
+              <w:jc w:val="center"/>
+            </w:pPr>
+            <w:r>
+              <w:rPr>
+                <w:rFonts w:ascii="Calibri" w:hAnsi="Calibri"/>
+                <w:b/>
+                <w:i w:val="0"/>
+                <w:color w:val="606973"/>
+                <w:sz w:val="17"/>
+              </w:rPr>
+              <w:t>Rare</w:t>
+            </w:r>
+          </w:p>
+        </w:tc>
+        <w:tc>
+          <w:tcPr>
+            <w:tcW w:type="dxa" w:w="5330"/>
+            <w:vAlign w:val="center"/>
+            <w:tcMar>
+              <w:top w:w="80" w:type="dxa"/>
+              <w:start w:w="120" w:type="dxa"/>
+              <w:bottom w:w="80" w:type="dxa"/>
+              <w:end w:w="120" w:type="dxa"/>
+            </w:tcMar>
+          </w:tcPr>
+          <w:p>
+            <w:pPr>
+              <w:spacing w:after="0" w:line="259" w:lineRule="auto"/>
+            </w:pPr>
+            <w:r>
+              <w:rPr>
+                <w:rFonts w:ascii="Calibri" w:hAnsi="Calibri"/>
+                <w:b w:val="0"/>
+                <w:i w:val="0"/>
+                <w:color w:val="2D3237"/>
+                <w:sz w:val="17"/>
+              </w:rPr>
+              <w:t>A plated subterranean giant with curved fault-line tusks. It senses deep pressure shifts and surfaces before earthquakes reach populated areas.</w:t>
+            </w:r>
+          </w:p>
+        </w:tc>
+      </w:tr>
+      <w:tr>
+        <w:tc>
+          <w:tcPr>
+            <w:tcW w:type="dxa" w:w="430"/>
+            <w:vAlign w:val="center"/>
+            <w:tcMar>
+              <w:top w:w="80" w:type="dxa"/>
+              <w:start w:w="120" w:type="dxa"/>
+              <w:bottom w:w="80" w:type="dxa"/>
+              <w:end w:w="120" w:type="dxa"/>
+            </w:tcMar>
+          </w:tcPr>
+          <w:p>
+            <w:pPr>
+              <w:spacing w:after="0"/>
+              <w:jc w:val="center"/>
+            </w:pPr>
+            <w:r>
+              <w:rPr>
+                <w:rFonts w:ascii="Calibri" w:hAnsi="Calibri"/>
+                <w:b/>
+                <w:i w:val="0"/>
+                <w:color w:val="606973"/>
+                <w:sz w:val="18"/>
+              </w:rPr>
+              <w:t>89</w:t>
+            </w:r>
+          </w:p>
+        </w:tc>
+        <w:tc>
+          <w:tcPr>
+            <w:tcW w:type="dxa" w:w="1500"/>
+            <w:vAlign w:val="center"/>
+            <w:tcMar>
+              <w:top w:w="80" w:type="dxa"/>
+              <w:start w:w="120" w:type="dxa"/>
+              <w:bottom w:w="80" w:type="dxa"/>
+              <w:end w:w="120" w:type="dxa"/>
+            </w:tcMar>
+          </w:tcPr>
+          <w:p>
+            <w:pPr>
+              <w:spacing w:after="20"/>
+            </w:pPr>
+            <w:r>
+              <w:rPr>
+                <w:rFonts w:ascii="Calibri" w:hAnsi="Calibri"/>
+                <w:b/>
+                <w:i w:val="0"/>
+                <w:color w:val="163147"/>
+                <w:sz w:val="19"/>
+              </w:rPr>
+              <w:t>Arcwren</w:t>
+            </w:r>
+          </w:p>
+          <w:p>
+            <w:pPr>
+              <w:spacing w:after="0"/>
+            </w:pPr>
+            <w:r>
+              <w:rPr>
+                <w:rFonts w:ascii="Calibri" w:hAnsi="Calibri"/>
+                <w:b w:val="0"/>
+                <w:i/>
+                <w:color w:val="606973"/>
+                <w:sz w:val="16"/>
+              </w:rPr>
+              <w:t>Stage 1 of 2</w:t>
+            </w:r>
+          </w:p>
+        </w:tc>
+        <w:tc>
+          <w:tcPr>
+            <w:tcW w:type="dxa" w:w="1250"/>
+            <w:vAlign w:val="center"/>
+            <w:tcMar>
+              <w:top w:w="80" w:type="dxa"/>
+              <w:start w:w="120" w:type="dxa"/>
+              <w:bottom w:w="80" w:type="dxa"/>
+              <w:end w:w="120" w:type="dxa"/>
+            </w:tcMar>
+          </w:tcPr>
+          <w:p>
+            <w:pPr>
+              <w:spacing w:after="0"/>
+              <w:jc w:val="center"/>
+            </w:pPr>
+            <w:r>
+              <w:rPr>
+                <w:rFonts w:ascii="Calibri" w:hAnsi="Calibri"/>
+                <w:b/>
+                <w:i w:val="0"/>
+                <w:color w:val="163147"/>
+                <w:sz w:val="17"/>
+              </w:rPr>
+              <w:t>Electric / Flying</w:t>
+            </w:r>
+          </w:p>
+        </w:tc>
+        <w:tc>
+          <w:tcPr>
+            <w:tcW w:type="dxa" w:w="850"/>
+            <w:vAlign w:val="center"/>
+            <w:tcMar>
+              <w:top w:w="80" w:type="dxa"/>
+              <w:start w:w="120" w:type="dxa"/>
+              <w:bottom w:w="80" w:type="dxa"/>
+              <w:end w:w="120" w:type="dxa"/>
+            </w:tcMar>
+          </w:tcPr>
+          <w:p>
+            <w:pPr>
+              <w:spacing w:after="0"/>
+              <w:jc w:val="center"/>
+            </w:pPr>
+            <w:r>
+              <w:rPr>
+                <w:rFonts w:ascii="Calibri" w:hAnsi="Calibri"/>
+                <w:b/>
+                <w:i w:val="0"/>
+                <w:color w:val="606973"/>
+                <w:sz w:val="17"/>
+              </w:rPr>
+              <w:t>Common</w:t>
+            </w:r>
+          </w:p>
+        </w:tc>
+        <w:tc>
+          <w:tcPr>
+            <w:tcW w:type="dxa" w:w="5330"/>
+            <w:vAlign w:val="center"/>
+            <w:tcMar>
+              <w:top w:w="80" w:type="dxa"/>
+              <w:start w:w="120" w:type="dxa"/>
+              <w:bottom w:w="80" w:type="dxa"/>
+              <w:end w:w="120" w:type="dxa"/>
+            </w:tcMar>
+          </w:tcPr>
+          <w:p>
+            <w:pPr>
+              <w:spacing w:after="0" w:line="259" w:lineRule="auto"/>
+            </w:pPr>
+            <w:r>
+              <w:rPr>
+                <w:rFonts w:ascii="Calibri" w:hAnsi="Calibri"/>
+                <w:b w:val="0"/>
+                <w:i w:val="0"/>
+                <w:color w:val="2D3237"/>
+                <w:sz w:val="17"/>
+              </w:rPr>
+              <w:t>A tiny darting flier with wire-thin feathers and a glowing throat. Flocks recharge by perching along naturally magnetic cliffs.</w:t>
+            </w:r>
+          </w:p>
+        </w:tc>
+      </w:tr>
+      <w:tr>
+        <w:tc>
+          <w:tcPr>
+            <w:tcW w:type="dxa" w:w="430"/>
+            <w:vAlign w:val="center"/>
+            <w:tcMar>
+              <w:top w:w="80" w:type="dxa"/>
+              <w:start w:w="120" w:type="dxa"/>
+              <w:bottom w:w="80" w:type="dxa"/>
+              <w:end w:w="120" w:type="dxa"/>
+            </w:tcMar>
+          </w:tcPr>
+          <w:p>
+            <w:pPr>
+              <w:spacing w:after="0"/>
+              <w:jc w:val="center"/>
+            </w:pPr>
+            <w:r>
+              <w:rPr>
+                <w:rFonts w:ascii="Calibri" w:hAnsi="Calibri"/>
+                <w:b/>
+                <w:i w:val="0"/>
+                <w:color w:val="606973"/>
+                <w:sz w:val="18"/>
+              </w:rPr>
+              <w:t>90</w:t>
+            </w:r>
+          </w:p>
+        </w:tc>
+        <w:tc>
+          <w:tcPr>
+            <w:tcW w:type="dxa" w:w="1500"/>
+            <w:vAlign w:val="center"/>
+            <w:tcMar>
+              <w:top w:w="80" w:type="dxa"/>
+              <w:start w:w="120" w:type="dxa"/>
+              <w:bottom w:w="80" w:type="dxa"/>
+              <w:end w:w="120" w:type="dxa"/>
+            </w:tcMar>
+          </w:tcPr>
+          <w:p>
+            <w:pPr>
+              <w:spacing w:after="20"/>
+            </w:pPr>
+            <w:r>
+              <w:rPr>
+                <w:rFonts w:ascii="Calibri" w:hAnsi="Calibri"/>
+                <w:b/>
+                <w:i w:val="0"/>
+                <w:color w:val="163147"/>
+                <w:sz w:val="19"/>
+              </w:rPr>
+              <w:t>Stormscribe</w:t>
+            </w:r>
+          </w:p>
+          <w:p>
+            <w:pPr>
+              <w:spacing w:after="0"/>
+            </w:pPr>
+            <w:r>
+              <w:rPr>
+                <w:rFonts w:ascii="Calibri" w:hAnsi="Calibri"/>
+                <w:b w:val="0"/>
+                <w:i/>
+                <w:color w:val="606973"/>
+                <w:sz w:val="16"/>
+              </w:rPr>
+              <w:t>Stage 2 of 2</w:t>
+            </w:r>
+          </w:p>
+        </w:tc>
+        <w:tc>
+          <w:tcPr>
+            <w:tcW w:type="dxa" w:w="1250"/>
+            <w:vAlign w:val="center"/>
+            <w:tcMar>
+              <w:top w:w="80" w:type="dxa"/>
+              <w:start w:w="120" w:type="dxa"/>
+              <w:bottom w:w="80" w:type="dxa"/>
+              <w:end w:w="120" w:type="dxa"/>
+            </w:tcMar>
+          </w:tcPr>
+          <w:p>
+            <w:pPr>
+              <w:spacing w:after="0"/>
+              <w:jc w:val="center"/>
+            </w:pPr>
+            <w:r>
+              <w:rPr>
+                <w:rFonts w:ascii="Calibri" w:hAnsi="Calibri"/>
+                <w:b/>
+                <w:i w:val="0"/>
+                <w:color w:val="163147"/>
+                <w:sz w:val="17"/>
+              </w:rPr>
+              <w:t>Electric / Flying</w:t>
+            </w:r>
+          </w:p>
+        </w:tc>
+        <w:tc>
+          <w:tcPr>
+            <w:tcW w:type="dxa" w:w="850"/>
+            <w:vAlign w:val="center"/>
+            <w:tcMar>
+              <w:top w:w="80" w:type="dxa"/>
+              <w:start w:w="120" w:type="dxa"/>
+              <w:bottom w:w="80" w:type="dxa"/>
+              <w:end w:w="120" w:type="dxa"/>
+            </w:tcMar>
+          </w:tcPr>
+          <w:p>
+            <w:pPr>
+              <w:spacing w:after="0"/>
+              <w:jc w:val="center"/>
+            </w:pPr>
+            <w:r>
+              <w:rPr>
+                <w:rFonts w:ascii="Calibri" w:hAnsi="Calibri"/>
+                <w:b/>
+                <w:i w:val="0"/>
+                <w:color w:val="606973"/>
+                <w:sz w:val="17"/>
+              </w:rPr>
+              <w:t>Uncommon</w:t>
+            </w:r>
+          </w:p>
+        </w:tc>
+        <w:tc>
+          <w:tcPr>
+            <w:tcW w:type="dxa" w:w="5330"/>
+            <w:vAlign w:val="center"/>
+            <w:tcMar>
+              <w:top w:w="80" w:type="dxa"/>
+              <w:start w:w="120" w:type="dxa"/>
+              <w:bottom w:w="80" w:type="dxa"/>
+              <w:end w:w="120" w:type="dxa"/>
+            </w:tcMar>
+          </w:tcPr>
+          <w:p>
+            <w:pPr>
+              <w:spacing w:after="0" w:line="259" w:lineRule="auto"/>
+            </w:pPr>
+            <w:r>
+              <w:rPr>
+                <w:rFonts w:ascii="Calibri" w:hAnsi="Calibri"/>
+                <w:b w:val="0"/>
+                <w:i w:val="0"/>
+                <w:color w:val="2D3237"/>
+                <w:sz w:val="17"/>
+              </w:rPr>
+              <w:t>A wide-winged weather bird whose charged feather tips draw symbols in clouds. Sailors study the patterns to anticipate dangerous fronts.</w:t>
+            </w:r>
+          </w:p>
+        </w:tc>
+      </w:tr>
+      <w:tr>
+        <w:tc>
+          <w:tcPr>
+            <w:tcW w:type="dxa" w:w="430"/>
+            <w:vAlign w:val="center"/>
+            <w:tcMar>
+              <w:top w:w="80" w:type="dxa"/>
+              <w:start w:w="120" w:type="dxa"/>
+              <w:bottom w:w="80" w:type="dxa"/>
+              <w:end w:w="120" w:type="dxa"/>
+            </w:tcMar>
+          </w:tcPr>
+          <w:p>
+            <w:pPr>
+              <w:spacing w:after="0"/>
+              <w:jc w:val="center"/>
+            </w:pPr>
+            <w:r>
+              <w:rPr>
+                <w:rFonts w:ascii="Calibri" w:hAnsi="Calibri"/>
+                <w:b/>
+                <w:i w:val="0"/>
+                <w:color w:val="606973"/>
+                <w:sz w:val="18"/>
+              </w:rPr>
+              <w:t>91</w:t>
+            </w:r>
+          </w:p>
+        </w:tc>
+        <w:tc>
+          <w:tcPr>
+            <w:tcW w:type="dxa" w:w="1500"/>
+            <w:vAlign w:val="center"/>
+            <w:tcMar>
+              <w:top w:w="80" w:type="dxa"/>
+              <w:start w:w="120" w:type="dxa"/>
+              <w:bottom w:w="80" w:type="dxa"/>
+              <w:end w:w="120" w:type="dxa"/>
+            </w:tcMar>
+          </w:tcPr>
+          <w:p>
+            <w:pPr>
+              <w:spacing w:after="20"/>
+            </w:pPr>
+            <w:r>
+              <w:rPr>
+                <w:rFonts w:ascii="Calibri" w:hAnsi="Calibri"/>
+                <w:b/>
+                <w:i w:val="0"/>
+                <w:color w:val="163147"/>
+                <w:sz w:val="19"/>
+              </w:rPr>
+              <w:t>Smudgling</w:t>
+            </w:r>
+          </w:p>
+          <w:p>
+            <w:pPr>
+              <w:spacing w:after="0"/>
+            </w:pPr>
+            <w:r>
+              <w:rPr>
+                <w:rFonts w:ascii="Calibri" w:hAnsi="Calibri"/>
+                <w:b w:val="0"/>
+                <w:i/>
+                <w:color w:val="606973"/>
+                <w:sz w:val="16"/>
+              </w:rPr>
+              <w:t>Stage 1 of 2</w:t>
+            </w:r>
+          </w:p>
+        </w:tc>
+        <w:tc>
+          <w:tcPr>
+            <w:tcW w:type="dxa" w:w="1250"/>
+            <w:vAlign w:val="center"/>
+            <w:tcMar>
+              <w:top w:w="80" w:type="dxa"/>
+              <w:start w:w="120" w:type="dxa"/>
+              <w:bottom w:w="80" w:type="dxa"/>
+              <w:end w:w="120" w:type="dxa"/>
+            </w:tcMar>
+          </w:tcPr>
+          <w:p>
+            <w:pPr>
+              <w:spacing w:after="0"/>
+              <w:jc w:val="center"/>
+            </w:pPr>
+            <w:r>
+              <w:rPr>
+                <w:rFonts w:ascii="Calibri" w:hAnsi="Calibri"/>
+                <w:b/>
+                <w:i w:val="0"/>
+                <w:color w:val="163147"/>
+                <w:sz w:val="17"/>
+              </w:rPr>
+              <w:t>Dark / Poison</w:t>
+            </w:r>
+          </w:p>
+        </w:tc>
+        <w:tc>
+          <w:tcPr>
+            <w:tcW w:type="dxa" w:w="850"/>
+            <w:vAlign w:val="center"/>
+            <w:tcMar>
+              <w:top w:w="80" w:type="dxa"/>
+              <w:start w:w="120" w:type="dxa"/>
+              <w:bottom w:w="80" w:type="dxa"/>
+              <w:end w:w="120" w:type="dxa"/>
+            </w:tcMar>
+          </w:tcPr>
+          <w:p>
+            <w:pPr>
+              <w:spacing w:after="0"/>
+              <w:jc w:val="center"/>
+            </w:pPr>
+            <w:r>
+              <w:rPr>
+                <w:rFonts w:ascii="Calibri" w:hAnsi="Calibri"/>
+                <w:b/>
+                <w:i w:val="0"/>
+                <w:color w:val="606973"/>
+                <w:sz w:val="17"/>
+              </w:rPr>
+              <w:t>Common</w:t>
+            </w:r>
+          </w:p>
+        </w:tc>
+        <w:tc>
+          <w:tcPr>
+            <w:tcW w:type="dxa" w:w="5330"/>
+            <w:vAlign w:val="center"/>
+            <w:tcMar>
+              <w:top w:w="80" w:type="dxa"/>
+              <w:start w:w="120" w:type="dxa"/>
+              <w:bottom w:w="80" w:type="dxa"/>
+              <w:end w:w="120" w:type="dxa"/>
+            </w:tcMar>
+          </w:tcPr>
+          <w:p>
+            <w:pPr>
+              <w:spacing w:after="0" w:line="259" w:lineRule="auto"/>
+            </w:pPr>
+            <w:r>
+              <w:rPr>
+                <w:rFonts w:ascii="Calibri" w:hAnsi="Calibri"/>
+                <w:b w:val="0"/>
+                <w:i w:val="0"/>
+                <w:color w:val="2D3237"/>
+                <w:sz w:val="17"/>
+              </w:rPr>
+              <w:t>A soft-bodied nocturnal creature that leaks harmless black dye when nervous. It hides among its own stains and feeds on toxic fungi.</w:t>
+            </w:r>
+          </w:p>
+        </w:tc>
+      </w:tr>
+      <w:tr>
+        <w:tc>
+          <w:tcPr>
+            <w:tcW w:type="dxa" w:w="430"/>
+            <w:vAlign w:val="center"/>
+            <w:tcMar>
+              <w:top w:w="80" w:type="dxa"/>
+              <w:start w:w="120" w:type="dxa"/>
+              <w:bottom w:w="80" w:type="dxa"/>
+              <w:end w:w="120" w:type="dxa"/>
+            </w:tcMar>
+          </w:tcPr>
+          <w:p>
+            <w:pPr>
+              <w:spacing w:after="0"/>
+              <w:jc w:val="center"/>
+            </w:pPr>
+            <w:r>
+              <w:rPr>
+                <w:rFonts w:ascii="Calibri" w:hAnsi="Calibri"/>
+                <w:b/>
+                <w:i w:val="0"/>
+                <w:color w:val="606973"/>
+                <w:sz w:val="18"/>
+              </w:rPr>
+              <w:t>92</w:t>
+            </w:r>
+          </w:p>
+        </w:tc>
+        <w:tc>
+          <w:tcPr>
+            <w:tcW w:type="dxa" w:w="1500"/>
+            <w:vAlign w:val="center"/>
+            <w:tcMar>
+              <w:top w:w="80" w:type="dxa"/>
+              <w:start w:w="120" w:type="dxa"/>
+              <w:bottom w:w="80" w:type="dxa"/>
+              <w:end w:w="120" w:type="dxa"/>
+            </w:tcMar>
+          </w:tcPr>
+          <w:p>
+            <w:pPr>
+              <w:spacing w:after="20"/>
+            </w:pPr>
+            <w:r>
+              <w:rPr>
+                <w:rFonts w:ascii="Calibri" w:hAnsi="Calibri"/>
+                <w:b/>
+                <w:i w:val="0"/>
+                <w:color w:val="163147"/>
+                <w:sz w:val="19"/>
+              </w:rPr>
+              <w:t>Inkraith</w:t>
+            </w:r>
+          </w:p>
+          <w:p>
+            <w:pPr>
+              <w:spacing w:after="0"/>
+            </w:pPr>
+            <w:r>
+              <w:rPr>
+                <w:rFonts w:ascii="Calibri" w:hAnsi="Calibri"/>
+                <w:b w:val="0"/>
+                <w:i/>
+                <w:color w:val="606973"/>
+                <w:sz w:val="16"/>
+              </w:rPr>
+              <w:t>Stage 2 of 2</w:t>
+            </w:r>
+          </w:p>
+        </w:tc>
+        <w:tc>
+          <w:tcPr>
+            <w:tcW w:type="dxa" w:w="1250"/>
+            <w:vAlign w:val="center"/>
+            <w:tcMar>
+              <w:top w:w="80" w:type="dxa"/>
+              <w:start w:w="120" w:type="dxa"/>
+              <w:bottom w:w="80" w:type="dxa"/>
+              <w:end w:w="120" w:type="dxa"/>
+            </w:tcMar>
+          </w:tcPr>
+          <w:p>
+            <w:pPr>
+              <w:spacing w:after="0"/>
+              <w:jc w:val="center"/>
+            </w:pPr>
+            <w:r>
+              <w:rPr>
+                <w:rFonts w:ascii="Calibri" w:hAnsi="Calibri"/>
+                <w:b/>
+                <w:i w:val="0"/>
+                <w:color w:val="163147"/>
+                <w:sz w:val="17"/>
+              </w:rPr>
+              <w:t>Dark / Ghost</w:t>
+            </w:r>
+          </w:p>
+        </w:tc>
+        <w:tc>
+          <w:tcPr>
+            <w:tcW w:type="dxa" w:w="850"/>
+            <w:vAlign w:val="center"/>
+            <w:tcMar>
+              <w:top w:w="80" w:type="dxa"/>
+              <w:start w:w="120" w:type="dxa"/>
+              <w:bottom w:w="80" w:type="dxa"/>
+              <w:end w:w="120" w:type="dxa"/>
+            </w:tcMar>
+          </w:tcPr>
+          <w:p>
+            <w:pPr>
+              <w:spacing w:after="0"/>
+              <w:jc w:val="center"/>
+            </w:pPr>
+            <w:r>
+              <w:rPr>
+                <w:rFonts w:ascii="Calibri" w:hAnsi="Calibri"/>
+                <w:b/>
+                <w:i w:val="0"/>
+                <w:color w:val="606973"/>
+                <w:sz w:val="17"/>
+              </w:rPr>
+              <w:t>Rare</w:t>
+            </w:r>
+          </w:p>
+        </w:tc>
+        <w:tc>
+          <w:tcPr>
+            <w:tcW w:type="dxa" w:w="5330"/>
+            <w:vAlign w:val="center"/>
+            <w:tcMar>
+              <w:top w:w="80" w:type="dxa"/>
+              <w:start w:w="120" w:type="dxa"/>
+              <w:bottom w:w="80" w:type="dxa"/>
+              <w:end w:w="120" w:type="dxa"/>
+            </w:tcMar>
+          </w:tcPr>
+          <w:p>
+            <w:pPr>
+              <w:spacing w:after="0" w:line="259" w:lineRule="auto"/>
+            </w:pPr>
+            <w:r>
+              <w:rPr>
+                <w:rFonts w:ascii="Calibri" w:hAnsi="Calibri"/>
+                <w:b w:val="0"/>
+                <w:i w:val="0"/>
+                <w:color w:val="2D3237"/>
+                <w:sz w:val="17"/>
+              </w:rPr>
+              <w:t>A fluid shadow spirit surrounded by drifting ink ribbons. It erases its outline completely before slipping through narrow cracks.</w:t>
+            </w:r>
+          </w:p>
+        </w:tc>
+      </w:tr>
+      <w:tr>
+        <w:tc>
+          <w:tcPr>
+            <w:tcW w:type="dxa" w:w="430"/>
+            <w:vAlign w:val="center"/>
+            <w:tcMar>
+              <w:top w:w="80" w:type="dxa"/>
+              <w:start w:w="120" w:type="dxa"/>
+              <w:bottom w:w="80" w:type="dxa"/>
+              <w:end w:w="120" w:type="dxa"/>
+            </w:tcMar>
+          </w:tcPr>
+          <w:p>
+            <w:pPr>
+              <w:spacing w:after="0"/>
+              <w:jc w:val="center"/>
+            </w:pPr>
+            <w:r>
+              <w:rPr>
+                <w:rFonts w:ascii="Calibri" w:hAnsi="Calibri"/>
+                <w:b/>
+                <w:i w:val="0"/>
+                <w:color w:val="606973"/>
+                <w:sz w:val="18"/>
+              </w:rPr>
+              <w:t>93</w:t>
+            </w:r>
+          </w:p>
+        </w:tc>
+        <w:tc>
+          <w:tcPr>
+            <w:tcW w:type="dxa" w:w="1500"/>
+            <w:vAlign w:val="center"/>
+            <w:tcMar>
+              <w:top w:w="80" w:type="dxa"/>
+              <w:start w:w="120" w:type="dxa"/>
+              <w:bottom w:w="80" w:type="dxa"/>
+              <w:end w:w="120" w:type="dxa"/>
+            </w:tcMar>
+          </w:tcPr>
+          <w:p>
+            <w:pPr>
+              <w:spacing w:after="20"/>
+            </w:pPr>
+            <w:r>
+              <w:rPr>
+                <w:rFonts w:ascii="Calibri" w:hAnsi="Calibri"/>
+                <w:b/>
+                <w:i w:val="0"/>
+                <w:color w:val="163147"/>
+                <w:sz w:val="19"/>
+              </w:rPr>
+              <w:t>Snoflet</w:t>
+            </w:r>
+          </w:p>
+          <w:p>
+            <w:pPr>
+              <w:spacing w:after="0"/>
+            </w:pPr>
+            <w:r>
+              <w:rPr>
+                <w:rFonts w:ascii="Calibri" w:hAnsi="Calibri"/>
+                <w:b w:val="0"/>
+                <w:i/>
+                <w:color w:val="606973"/>
+                <w:sz w:val="16"/>
+              </w:rPr>
+              <w:t>Stage 1 of 2</w:t>
+            </w:r>
+          </w:p>
+        </w:tc>
+        <w:tc>
+          <w:tcPr>
+            <w:tcW w:type="dxa" w:w="1250"/>
+            <w:vAlign w:val="center"/>
+            <w:tcMar>
+              <w:top w:w="80" w:type="dxa"/>
+              <w:start w:w="120" w:type="dxa"/>
+              <w:bottom w:w="80" w:type="dxa"/>
+              <w:end w:w="120" w:type="dxa"/>
+            </w:tcMar>
+          </w:tcPr>
+          <w:p>
+            <w:pPr>
+              <w:spacing w:after="0"/>
+              <w:jc w:val="center"/>
+            </w:pPr>
+            <w:r>
+              <w:rPr>
+                <w:rFonts w:ascii="Calibri" w:hAnsi="Calibri"/>
+                <w:b/>
+                <w:i w:val="0"/>
+                <w:color w:val="163147"/>
+                <w:sz w:val="17"/>
+              </w:rPr>
+              <w:t>Ice / Fairy</w:t>
+            </w:r>
+          </w:p>
+        </w:tc>
+        <w:tc>
+          <w:tcPr>
+            <w:tcW w:type="dxa" w:w="850"/>
+            <w:vAlign w:val="center"/>
+            <w:tcMar>
+              <w:top w:w="80" w:type="dxa"/>
+              <w:start w:w="120" w:type="dxa"/>
+              <w:bottom w:w="80" w:type="dxa"/>
+              <w:end w:w="120" w:type="dxa"/>
+            </w:tcMar>
+          </w:tcPr>
+          <w:p>
+            <w:pPr>
+              <w:spacing w:after="0"/>
+              <w:jc w:val="center"/>
+            </w:pPr>
+            <w:r>
+              <w:rPr>
+                <w:rFonts w:ascii="Calibri" w:hAnsi="Calibri"/>
+                <w:b/>
+                <w:i w:val="0"/>
+                <w:color w:val="606973"/>
+                <w:sz w:val="17"/>
+              </w:rPr>
+              <w:t>Common</w:t>
+            </w:r>
+          </w:p>
+        </w:tc>
+        <w:tc>
+          <w:tcPr>
+            <w:tcW w:type="dxa" w:w="5330"/>
+            <w:vAlign w:val="center"/>
+            <w:tcMar>
+              <w:top w:w="80" w:type="dxa"/>
+              <w:start w:w="120" w:type="dxa"/>
+              <w:bottom w:w="80" w:type="dxa"/>
+              <w:end w:w="120" w:type="dxa"/>
+            </w:tcMar>
+          </w:tcPr>
+          <w:p>
+            <w:pPr>
+              <w:spacing w:after="0" w:line="259" w:lineRule="auto"/>
+            </w:pPr>
+            <w:r>
+              <w:rPr>
+                <w:rFonts w:ascii="Calibri" w:hAnsi="Calibri"/>
+                <w:b w:val="0"/>
+                <w:i w:val="0"/>
+                <w:color w:val="2D3237"/>
+                <w:sz w:val="17"/>
+              </w:rPr>
+              <w:t>A delicate snowfield creature with bell-shaped ears and powdery feet. Its chiming calls keep separated groups together during blizzards.</w:t>
+            </w:r>
+          </w:p>
+        </w:tc>
+      </w:tr>
+      <w:tr>
+        <w:tc>
+          <w:tcPr>
+            <w:tcW w:type="dxa" w:w="430"/>
+            <w:vAlign w:val="center"/>
+            <w:tcMar>
+              <w:top w:w="80" w:type="dxa"/>
+              <w:start w:w="120" w:type="dxa"/>
+              <w:bottom w:w="80" w:type="dxa"/>
+              <w:end w:w="120" w:type="dxa"/>
+            </w:tcMar>
+          </w:tcPr>
+          <w:p>
+            <w:pPr>
+              <w:spacing w:after="0"/>
+              <w:jc w:val="center"/>
+            </w:pPr>
+            <w:r>
+              <w:rPr>
+                <w:rFonts w:ascii="Calibri" w:hAnsi="Calibri"/>
+                <w:b/>
+                <w:i w:val="0"/>
+                <w:color w:val="606973"/>
+                <w:sz w:val="18"/>
+              </w:rPr>
+              <w:t>94</w:t>
+            </w:r>
+          </w:p>
+        </w:tc>
+        <w:tc>
+          <w:tcPr>
+            <w:tcW w:type="dxa" w:w="1500"/>
+            <w:vAlign w:val="center"/>
+            <w:tcMar>
+              <w:top w:w="80" w:type="dxa"/>
+              <w:start w:w="120" w:type="dxa"/>
+              <w:bottom w:w="80" w:type="dxa"/>
+              <w:end w:w="120" w:type="dxa"/>
+            </w:tcMar>
+          </w:tcPr>
+          <w:p>
+            <w:pPr>
+              <w:spacing w:after="20"/>
+            </w:pPr>
+            <w:r>
+              <w:rPr>
+                <w:rFonts w:ascii="Calibri" w:hAnsi="Calibri"/>
+                <w:b/>
+                <w:i w:val="0"/>
+                <w:color w:val="163147"/>
+                <w:sz w:val="19"/>
+              </w:rPr>
+              <w:t>Choralice</w:t>
+            </w:r>
+          </w:p>
+          <w:p>
+            <w:pPr>
+              <w:spacing w:after="0"/>
+            </w:pPr>
+            <w:r>
+              <w:rPr>
+                <w:rFonts w:ascii="Calibri" w:hAnsi="Calibri"/>
+                <w:b w:val="0"/>
+                <w:i/>
+                <w:color w:val="606973"/>
+                <w:sz w:val="16"/>
+              </w:rPr>
+              <w:t>Stage 2 of 2</w:t>
+            </w:r>
+          </w:p>
+        </w:tc>
+        <w:tc>
+          <w:tcPr>
+            <w:tcW w:type="dxa" w:w="1250"/>
+            <w:vAlign w:val="center"/>
+            <w:tcMar>
+              <w:top w:w="80" w:type="dxa"/>
+              <w:start w:w="120" w:type="dxa"/>
+              <w:bottom w:w="80" w:type="dxa"/>
+              <w:end w:w="120" w:type="dxa"/>
+            </w:tcMar>
+          </w:tcPr>
+          <w:p>
+            <w:pPr>
+              <w:spacing w:after="0"/>
+              <w:jc w:val="center"/>
+            </w:pPr>
+            <w:r>
+              <w:rPr>
+                <w:rFonts w:ascii="Calibri" w:hAnsi="Calibri"/>
+                <w:b/>
+                <w:i w:val="0"/>
+                <w:color w:val="163147"/>
+                <w:sz w:val="17"/>
+              </w:rPr>
+              <w:t>Ice / Fairy</w:t>
+            </w:r>
+          </w:p>
+        </w:tc>
+        <w:tc>
+          <w:tcPr>
+            <w:tcW w:type="dxa" w:w="850"/>
+            <w:vAlign w:val="center"/>
+            <w:tcMar>
+              <w:top w:w="80" w:type="dxa"/>
+              <w:start w:w="120" w:type="dxa"/>
+              <w:bottom w:w="80" w:type="dxa"/>
+              <w:end w:w="120" w:type="dxa"/>
+            </w:tcMar>
+          </w:tcPr>
+          <w:p>
+            <w:pPr>
+              <w:spacing w:after="0"/>
+              <w:jc w:val="center"/>
+            </w:pPr>
+            <w:r>
+              <w:rPr>
+                <w:rFonts w:ascii="Calibri" w:hAnsi="Calibri"/>
+                <w:b/>
+                <w:i w:val="0"/>
+                <w:color w:val="606973"/>
+                <w:sz w:val="17"/>
+              </w:rPr>
+              <w:t>Uncommon</w:t>
+            </w:r>
+          </w:p>
+        </w:tc>
+        <w:tc>
+          <w:tcPr>
+            <w:tcW w:type="dxa" w:w="5330"/>
+            <w:vAlign w:val="center"/>
+            <w:tcMar>
+              <w:top w:w="80" w:type="dxa"/>
+              <w:start w:w="120" w:type="dxa"/>
+              <w:bottom w:w="80" w:type="dxa"/>
+              <w:end w:w="120" w:type="dxa"/>
+            </w:tcMar>
+          </w:tcPr>
+          <w:p>
+            <w:pPr>
+              <w:spacing w:after="0" w:line="259" w:lineRule="auto"/>
+            </w:pPr>
+            <w:r>
+              <w:rPr>
+                <w:rFonts w:ascii="Calibri" w:hAnsi="Calibri"/>
+                <w:b w:val="0"/>
+                <w:i w:val="0"/>
+                <w:color w:val="2D3237"/>
+                <w:sz w:val="17"/>
+              </w:rPr>
+              <w:t>A crystalline herd leader with layered resonant horns. Its harmonies shape blowing snow into temporary walls and sheltered pathways.</w:t>
+            </w:r>
+          </w:p>
+        </w:tc>
+      </w:tr>
+      <w:tr>
+        <w:tc>
+          <w:tcPr>
+            <w:tcW w:type="dxa" w:w="430"/>
+            <w:vAlign w:val="center"/>
+            <w:tcMar>
+              <w:top w:w="80" w:type="dxa"/>
+              <w:start w:w="120" w:type="dxa"/>
+              <w:bottom w:w="80" w:type="dxa"/>
+              <w:end w:w="120" w:type="dxa"/>
+            </w:tcMar>
+          </w:tcPr>
+          <w:p>
+            <w:pPr>
+              <w:spacing w:after="0"/>
+              <w:jc w:val="center"/>
+            </w:pPr>
+            <w:r>
+              <w:rPr>
+                <w:rFonts w:ascii="Calibri" w:hAnsi="Calibri"/>
+                <w:b/>
+                <w:i w:val="0"/>
+                <w:color w:val="606973"/>
+                <w:sz w:val="18"/>
+              </w:rPr>
+              <w:t>95</w:t>
+            </w:r>
+          </w:p>
+        </w:tc>
+        <w:tc>
+          <w:tcPr>
+            <w:tcW w:type="dxa" w:w="1500"/>
+            <w:vAlign w:val="center"/>
+            <w:tcMar>
+              <w:top w:w="80" w:type="dxa"/>
+              <w:start w:w="120" w:type="dxa"/>
+              <w:bottom w:w="80" w:type="dxa"/>
+              <w:end w:w="120" w:type="dxa"/>
+            </w:tcMar>
+          </w:tcPr>
+          <w:p>
+            <w:pPr>
+              <w:spacing w:after="20"/>
+            </w:pPr>
+            <w:r>
+              <w:rPr>
+                <w:rFonts w:ascii="Calibri" w:hAnsi="Calibri"/>
+                <w:b/>
+                <w:i w:val="0"/>
+                <w:color w:val="163147"/>
+                <w:sz w:val="19"/>
+              </w:rPr>
+              <w:t>Rivetram</w:t>
+            </w:r>
+          </w:p>
+          <w:p>
+            <w:pPr>
+              <w:spacing w:after="0"/>
+            </w:pPr>
+            <w:r>
+              <w:rPr>
+                <w:rFonts w:ascii="Calibri" w:hAnsi="Calibri"/>
+                <w:b w:val="0"/>
+                <w:i/>
+                <w:color w:val="606973"/>
+                <w:sz w:val="16"/>
+              </w:rPr>
+              <w:t>Standalone</w:t>
+            </w:r>
+          </w:p>
+        </w:tc>
+        <w:tc>
+          <w:tcPr>
+            <w:tcW w:type="dxa" w:w="1250"/>
+            <w:vAlign w:val="center"/>
+            <w:tcMar>
+              <w:top w:w="80" w:type="dxa"/>
+              <w:start w:w="120" w:type="dxa"/>
+              <w:bottom w:w="80" w:type="dxa"/>
+              <w:end w:w="120" w:type="dxa"/>
+            </w:tcMar>
+          </w:tcPr>
+          <w:p>
+            <w:pPr>
+              <w:spacing w:after="0"/>
+              <w:jc w:val="center"/>
+            </w:pPr>
+            <w:r>
+              <w:rPr>
+                <w:rFonts w:ascii="Calibri" w:hAnsi="Calibri"/>
+                <w:b/>
+                <w:i w:val="0"/>
+                <w:color w:val="163147"/>
+                <w:sz w:val="17"/>
+              </w:rPr>
+              <w:t>Steel / Fighting</w:t>
+            </w:r>
+          </w:p>
+        </w:tc>
+        <w:tc>
+          <w:tcPr>
+            <w:tcW w:type="dxa" w:w="850"/>
+            <w:vAlign w:val="center"/>
+            <w:tcMar>
+              <w:top w:w="80" w:type="dxa"/>
+              <w:start w:w="120" w:type="dxa"/>
+              <w:bottom w:w="80" w:type="dxa"/>
+              <w:end w:w="120" w:type="dxa"/>
+            </w:tcMar>
+          </w:tcPr>
+          <w:p>
+            <w:pPr>
+              <w:spacing w:after="0"/>
+              <w:jc w:val="center"/>
+            </w:pPr>
+            <w:r>
+              <w:rPr>
+                <w:rFonts w:ascii="Calibri" w:hAnsi="Calibri"/>
+                <w:b/>
+                <w:i w:val="0"/>
+                <w:color w:val="606973"/>
+                <w:sz w:val="17"/>
+              </w:rPr>
+              <w:t>Uncommon</w:t>
+            </w:r>
+          </w:p>
+        </w:tc>
+        <w:tc>
+          <w:tcPr>
+            <w:tcW w:type="dxa" w:w="5330"/>
+            <w:vAlign w:val="center"/>
+            <w:tcMar>
+              <w:top w:w="80" w:type="dxa"/>
+              <w:start w:w="120" w:type="dxa"/>
+              <w:bottom w:w="80" w:type="dxa"/>
+              <w:end w:w="120" w:type="dxa"/>
+            </w:tcMar>
+          </w:tcPr>
+          <w:p>
+            <w:pPr>
+              <w:spacing w:after="0" w:line="259" w:lineRule="auto"/>
+            </w:pPr>
+            <w:r>
+              <w:rPr>
+                <w:rFonts w:ascii="Calibri" w:hAnsi="Calibri"/>
+                <w:b w:val="0"/>
+                <w:i w:val="0"/>
+                <w:color w:val="2D3237"/>
+                <w:sz w:val="17"/>
+              </w:rPr>
+              <w:t>A compact horned laborer held together by visible rotating rivets. It braces damaged structures and refuses to move until everyone is safe.</w:t>
+            </w:r>
+          </w:p>
+        </w:tc>
+      </w:tr>
+      <w:tr>
+        <w:tc>
+          <w:tcPr>
+            <w:tcW w:type="dxa" w:w="430"/>
+            <w:vAlign w:val="center"/>
+            <w:tcMar>
+              <w:top w:w="80" w:type="dxa"/>
+              <w:start w:w="120" w:type="dxa"/>
+              <w:bottom w:w="80" w:type="dxa"/>
+              <w:end w:w="120" w:type="dxa"/>
+            </w:tcMar>
+          </w:tcPr>
+          <w:p>
+            <w:pPr>
+              <w:spacing w:after="0"/>
+              <w:jc w:val="center"/>
+            </w:pPr>
+            <w:r>
+              <w:rPr>
+                <w:rFonts w:ascii="Calibri" w:hAnsi="Calibri"/>
+                <w:b/>
+                <w:i w:val="0"/>
+                <w:color w:val="606973"/>
+                <w:sz w:val="18"/>
+              </w:rPr>
+              <w:t>96</w:t>
+            </w:r>
+          </w:p>
+        </w:tc>
+        <w:tc>
+          <w:tcPr>
+            <w:tcW w:type="dxa" w:w="1500"/>
+            <w:vAlign w:val="center"/>
+            <w:tcMar>
+              <w:top w:w="80" w:type="dxa"/>
+              <w:start w:w="120" w:type="dxa"/>
+              <w:bottom w:w="80" w:type="dxa"/>
+              <w:end w:w="120" w:type="dxa"/>
+            </w:tcMar>
+          </w:tcPr>
+          <w:p>
+            <w:pPr>
+              <w:spacing w:after="20"/>
+            </w:pPr>
+            <w:r>
+              <w:rPr>
+                <w:rFonts w:ascii="Calibri" w:hAnsi="Calibri"/>
+                <w:b/>
+                <w:i w:val="0"/>
+                <w:color w:val="163147"/>
+                <w:sz w:val="19"/>
+              </w:rPr>
+              <w:t>Mnemonax</w:t>
+            </w:r>
+          </w:p>
+          <w:p>
+            <w:pPr>
+              <w:spacing w:after="0"/>
+            </w:pPr>
+            <w:r>
+              <w:rPr>
+                <w:rFonts w:ascii="Calibri" w:hAnsi="Calibri"/>
+                <w:b w:val="0"/>
+                <w:i/>
+                <w:color w:val="606973"/>
+                <w:sz w:val="16"/>
+              </w:rPr>
+              <w:t>Standalone</w:t>
+            </w:r>
+          </w:p>
+        </w:tc>
+        <w:tc>
+          <w:tcPr>
+            <w:tcW w:type="dxa" w:w="1250"/>
+            <w:vAlign w:val="center"/>
+            <w:tcMar>
+              <w:top w:w="80" w:type="dxa"/>
+              <w:start w:w="120" w:type="dxa"/>
+              <w:bottom w:w="80" w:type="dxa"/>
+              <w:end w:w="120" w:type="dxa"/>
+            </w:tcMar>
+          </w:tcPr>
+          <w:p>
+            <w:pPr>
+              <w:spacing w:after="0"/>
+              <w:jc w:val="center"/>
+            </w:pPr>
+            <w:r>
+              <w:rPr>
+                <w:rFonts w:ascii="Calibri" w:hAnsi="Calibri"/>
+                <w:b/>
+                <w:i w:val="0"/>
+                <w:color w:val="163147"/>
+                <w:sz w:val="17"/>
+              </w:rPr>
+              <w:t>Psychic / Dragon</w:t>
+            </w:r>
+          </w:p>
+        </w:tc>
+        <w:tc>
+          <w:tcPr>
+            <w:tcW w:type="dxa" w:w="850"/>
+            <w:vAlign w:val="center"/>
+            <w:tcMar>
+              <w:top w:w="80" w:type="dxa"/>
+              <w:start w:w="120" w:type="dxa"/>
+              <w:bottom w:w="80" w:type="dxa"/>
+              <w:end w:w="120" w:type="dxa"/>
+            </w:tcMar>
+          </w:tcPr>
+          <w:p>
+            <w:pPr>
+              <w:spacing w:after="0"/>
+              <w:jc w:val="center"/>
+            </w:pPr>
+            <w:r>
+              <w:rPr>
+                <w:rFonts w:ascii="Calibri" w:hAnsi="Calibri"/>
+                <w:b/>
+                <w:i w:val="0"/>
+                <w:color w:val="606973"/>
+                <w:sz w:val="17"/>
+              </w:rPr>
+              <w:t>Rare</w:t>
+            </w:r>
+          </w:p>
+        </w:tc>
+        <w:tc>
+          <w:tcPr>
+            <w:tcW w:type="dxa" w:w="5330"/>
+            <w:vAlign w:val="center"/>
+            <w:tcMar>
+              <w:top w:w="80" w:type="dxa"/>
+              <w:start w:w="120" w:type="dxa"/>
+              <w:bottom w:w="80" w:type="dxa"/>
+              <w:end w:w="120" w:type="dxa"/>
+            </w:tcMar>
+          </w:tcPr>
+          <w:p>
+            <w:pPr>
+              <w:spacing w:after="0" w:line="259" w:lineRule="auto"/>
+            </w:pPr>
+            <w:r>
+              <w:rPr>
+                <w:rFonts w:ascii="Calibri" w:hAnsi="Calibri"/>
+                <w:b w:val="0"/>
+                <w:i w:val="0"/>
+                <w:color w:val="2D3237"/>
+                <w:sz w:val="17"/>
+              </w:rPr>
+              <w:t>A slender many-crested dragon whose scales display moving fragments of remembered places. It guards knowledge rather than territory.</w:t>
+            </w:r>
+          </w:p>
+        </w:tc>
+      </w:tr>
+      <w:tr>
+        <w:tc>
+          <w:tcPr>
+            <w:tcW w:type="dxa" w:w="430"/>
+            <w:vAlign w:val="center"/>
+            <w:tcMar>
+              <w:top w:w="80" w:type="dxa"/>
+              <w:start w:w="120" w:type="dxa"/>
+              <w:bottom w:w="80" w:type="dxa"/>
+              <w:end w:w="120" w:type="dxa"/>
+            </w:tcMar>
+          </w:tcPr>
+          <w:p>
+            <w:pPr>
+              <w:spacing w:after="0"/>
+              <w:jc w:val="center"/>
+            </w:pPr>
+            <w:r>
+              <w:rPr>
+                <w:rFonts w:ascii="Calibri" w:hAnsi="Calibri"/>
+                <w:b/>
+                <w:i w:val="0"/>
+                <w:color w:val="606973"/>
+                <w:sz w:val="18"/>
+              </w:rPr>
+              <w:t>97</w:t>
+            </w:r>
+          </w:p>
+        </w:tc>
+        <w:tc>
+          <w:tcPr>
+            <w:tcW w:type="dxa" w:w="1500"/>
+            <w:vAlign w:val="center"/>
+            <w:tcMar>
+              <w:top w:w="80" w:type="dxa"/>
+              <w:start w:w="120" w:type="dxa"/>
+              <w:bottom w:w="80" w:type="dxa"/>
+              <w:end w:w="120" w:type="dxa"/>
+            </w:tcMar>
+          </w:tcPr>
+          <w:p>
+            <w:pPr>
+              <w:spacing w:after="20"/>
+            </w:pPr>
+            <w:r>
+              <w:rPr>
+                <w:rFonts w:ascii="Calibri" w:hAnsi="Calibri"/>
+                <w:b/>
+                <w:i w:val="0"/>
+                <w:color w:val="163147"/>
+                <w:sz w:val="19"/>
+              </w:rPr>
+              <w:t>Charcoil</w:t>
+            </w:r>
+          </w:p>
+          <w:p>
+            <w:pPr>
+              <w:spacing w:after="0"/>
+            </w:pPr>
+            <w:r>
+              <w:rPr>
+                <w:rFonts w:ascii="Calibri" w:hAnsi="Calibri"/>
+                <w:b w:val="0"/>
+                <w:i/>
+                <w:color w:val="606973"/>
+                <w:sz w:val="16"/>
+              </w:rPr>
+              <w:t>Standalone</w:t>
+            </w:r>
+          </w:p>
+        </w:tc>
+        <w:tc>
+          <w:tcPr>
+            <w:tcW w:type="dxa" w:w="1250"/>
+            <w:vAlign w:val="center"/>
+            <w:tcMar>
+              <w:top w:w="80" w:type="dxa"/>
+              <w:start w:w="120" w:type="dxa"/>
+              <w:bottom w:w="80" w:type="dxa"/>
+              <w:end w:w="120" w:type="dxa"/>
+            </w:tcMar>
+          </w:tcPr>
+          <w:p>
+            <w:pPr>
+              <w:spacing w:after="0"/>
+              <w:jc w:val="center"/>
+            </w:pPr>
+            <w:r>
+              <w:rPr>
+                <w:rFonts w:ascii="Calibri" w:hAnsi="Calibri"/>
+                <w:b/>
+                <w:i w:val="0"/>
+                <w:color w:val="163147"/>
+                <w:sz w:val="17"/>
+              </w:rPr>
+              <w:t>Fire / Dragon</w:t>
+            </w:r>
+          </w:p>
+        </w:tc>
+        <w:tc>
+          <w:tcPr>
+            <w:tcW w:type="dxa" w:w="850"/>
+            <w:vAlign w:val="center"/>
+            <w:tcMar>
+              <w:top w:w="80" w:type="dxa"/>
+              <w:start w:w="120" w:type="dxa"/>
+              <w:bottom w:w="80" w:type="dxa"/>
+              <w:end w:w="120" w:type="dxa"/>
+            </w:tcMar>
+          </w:tcPr>
+          <w:p>
+            <w:pPr>
+              <w:spacing w:after="0"/>
+              <w:jc w:val="center"/>
+            </w:pPr>
+            <w:r>
+              <w:rPr>
+                <w:rFonts w:ascii="Calibri" w:hAnsi="Calibri"/>
+                <w:b/>
+                <w:i w:val="0"/>
+                <w:color w:val="606973"/>
+                <w:sz w:val="17"/>
+              </w:rPr>
+              <w:t>Uncommon</w:t>
+            </w:r>
+          </w:p>
+        </w:tc>
+        <w:tc>
+          <w:tcPr>
+            <w:tcW w:type="dxa" w:w="5330"/>
+            <w:vAlign w:val="center"/>
+            <w:tcMar>
+              <w:top w:w="80" w:type="dxa"/>
+              <w:start w:w="120" w:type="dxa"/>
+              <w:bottom w:w="80" w:type="dxa"/>
+              <w:end w:w="120" w:type="dxa"/>
+            </w:tcMar>
+          </w:tcPr>
+          <w:p>
+            <w:pPr>
+              <w:spacing w:after="0" w:line="259" w:lineRule="auto"/>
+            </w:pPr>
+            <w:r>
+              <w:rPr>
+                <w:rFonts w:ascii="Calibri" w:hAnsi="Calibri"/>
+                <w:b w:val="0"/>
+                <w:i w:val="0"/>
+                <w:color w:val="2D3237"/>
+                <w:sz w:val="17"/>
+              </w:rPr>
+              <w:t>A small serpentine furnace creature wrapped around a ceramic heat core. It carefully maintains incubation temperatures in volcanic nesting caves.</w:t>
+            </w:r>
+          </w:p>
+        </w:tc>
+      </w:tr>
+      <w:tr>
+        <w:tc>
+          <w:tcPr>
+            <w:tcW w:type="dxa" w:w="430"/>
+            <w:vAlign w:val="center"/>
+            <w:tcMar>
+              <w:top w:w="80" w:type="dxa"/>
+              <w:start w:w="120" w:type="dxa"/>
+              <w:bottom w:w="80" w:type="dxa"/>
+              <w:end w:w="120" w:type="dxa"/>
+            </w:tcMar>
+          </w:tcPr>
+          <w:p>
+            <w:pPr>
+              <w:spacing w:after="0"/>
+              <w:jc w:val="center"/>
+            </w:pPr>
+            <w:r>
+              <w:rPr>
+                <w:rFonts w:ascii="Calibri" w:hAnsi="Calibri"/>
+                <w:b/>
+                <w:i w:val="0"/>
+                <w:color w:val="606973"/>
+                <w:sz w:val="18"/>
+              </w:rPr>
+              <w:t>98</w:t>
+            </w:r>
+          </w:p>
+        </w:tc>
+        <w:tc>
+          <w:tcPr>
+            <w:tcW w:type="dxa" w:w="1500"/>
+            <w:vAlign w:val="center"/>
+            <w:tcMar>
+              <w:top w:w="80" w:type="dxa"/>
+              <w:start w:w="120" w:type="dxa"/>
+              <w:bottom w:w="80" w:type="dxa"/>
+              <w:end w:w="120" w:type="dxa"/>
+            </w:tcMar>
+          </w:tcPr>
+          <w:p>
+            <w:pPr>
+              <w:spacing w:after="20"/>
+            </w:pPr>
+            <w:r>
+              <w:rPr>
+                <w:rFonts w:ascii="Calibri" w:hAnsi="Calibri"/>
+                <w:b/>
+                <w:i w:val="0"/>
+                <w:color w:val="163147"/>
+                <w:sz w:val="19"/>
+              </w:rPr>
+              <w:t>Mireglass</w:t>
+            </w:r>
+          </w:p>
+          <w:p>
+            <w:pPr>
+              <w:spacing w:after="0"/>
+            </w:pPr>
+            <w:r>
+              <w:rPr>
+                <w:rFonts w:ascii="Calibri" w:hAnsi="Calibri"/>
+                <w:b w:val="0"/>
+                <w:i/>
+                <w:color w:val="606973"/>
+                <w:sz w:val="16"/>
+              </w:rPr>
+              <w:t>Standalone</w:t>
+            </w:r>
+          </w:p>
+        </w:tc>
+        <w:tc>
+          <w:tcPr>
+            <w:tcW w:type="dxa" w:w="1250"/>
+            <w:vAlign w:val="center"/>
+            <w:tcMar>
+              <w:top w:w="80" w:type="dxa"/>
+              <w:start w:w="120" w:type="dxa"/>
+              <w:bottom w:w="80" w:type="dxa"/>
+              <w:end w:w="120" w:type="dxa"/>
+            </w:tcMar>
+          </w:tcPr>
+          <w:p>
+            <w:pPr>
+              <w:spacing w:after="0"/>
+              <w:jc w:val="center"/>
+            </w:pPr>
+            <w:r>
+              <w:rPr>
+                <w:rFonts w:ascii="Calibri" w:hAnsi="Calibri"/>
+                <w:b/>
+                <w:i w:val="0"/>
+                <w:color w:val="163147"/>
+                <w:sz w:val="17"/>
+              </w:rPr>
+              <w:t>Poison / Steel</w:t>
+            </w:r>
+          </w:p>
+        </w:tc>
+        <w:tc>
+          <w:tcPr>
+            <w:tcW w:type="dxa" w:w="850"/>
+            <w:vAlign w:val="center"/>
+            <w:tcMar>
+              <w:top w:w="80" w:type="dxa"/>
+              <w:start w:w="120" w:type="dxa"/>
+              <w:bottom w:w="80" w:type="dxa"/>
+              <w:end w:w="120" w:type="dxa"/>
+            </w:tcMar>
+          </w:tcPr>
+          <w:p>
+            <w:pPr>
+              <w:spacing w:after="0"/>
+              <w:jc w:val="center"/>
+            </w:pPr>
+            <w:r>
+              <w:rPr>
+                <w:rFonts w:ascii="Calibri" w:hAnsi="Calibri"/>
+                <w:b/>
+                <w:i w:val="0"/>
+                <w:color w:val="606973"/>
+                <w:sz w:val="17"/>
+              </w:rPr>
+              <w:t>Common</w:t>
+            </w:r>
+          </w:p>
+        </w:tc>
+        <w:tc>
+          <w:tcPr>
+            <w:tcW w:type="dxa" w:w="5330"/>
+            <w:vAlign w:val="center"/>
+            <w:tcMar>
+              <w:top w:w="80" w:type="dxa"/>
+              <w:start w:w="120" w:type="dxa"/>
+              <w:bottom w:w="80" w:type="dxa"/>
+              <w:end w:w="120" w:type="dxa"/>
+            </w:tcMar>
+          </w:tcPr>
+          <w:p>
+            <w:pPr>
+              <w:spacing w:after="0" w:line="259" w:lineRule="auto"/>
+            </w:pPr>
+            <w:r>
+              <w:rPr>
+                <w:rFonts w:ascii="Calibri" w:hAnsi="Calibri"/>
+                <w:b w:val="0"/>
+                <w:i w:val="0"/>
+                <w:color w:val="2D3237"/>
+                <w:sz w:val="17"/>
+              </w:rPr>
+              <w:t>A transparent marsh crawler with metallic organs visible beneath its shell. It traps pollutants inside replaceable glassy plates.</w:t>
+            </w:r>
+          </w:p>
+        </w:tc>
+      </w:tr>
+      <w:tr>
+        <w:tc>
+          <w:tcPr>
+            <w:tcW w:type="dxa" w:w="430"/>
+            <w:vAlign w:val="center"/>
+            <w:tcMar>
+              <w:top w:w="80" w:type="dxa"/>
+              <w:start w:w="120" w:type="dxa"/>
+              <w:bottom w:w="80" w:type="dxa"/>
+              <w:end w:w="120" w:type="dxa"/>
+            </w:tcMar>
+          </w:tcPr>
+          <w:p>
+            <w:pPr>
+              <w:spacing w:after="0"/>
+              <w:jc w:val="center"/>
+            </w:pPr>
+            <w:r>
+              <w:rPr>
+                <w:rFonts w:ascii="Calibri" w:hAnsi="Calibri"/>
+                <w:b/>
+                <w:i w:val="0"/>
+                <w:color w:val="606973"/>
+                <w:sz w:val="18"/>
+              </w:rPr>
+              <w:t>99</w:t>
+            </w:r>
+          </w:p>
+        </w:tc>
+        <w:tc>
+          <w:tcPr>
+            <w:tcW w:type="dxa" w:w="1500"/>
+            <w:vAlign w:val="center"/>
+            <w:tcMar>
+              <w:top w:w="80" w:type="dxa"/>
+              <w:start w:w="120" w:type="dxa"/>
+              <w:bottom w:w="80" w:type="dxa"/>
+              <w:end w:w="120" w:type="dxa"/>
+            </w:tcMar>
+          </w:tcPr>
+          <w:p>
+            <w:pPr>
+              <w:spacing w:after="20"/>
+            </w:pPr>
+            <w:r>
+              <w:rPr>
+                <w:rFonts w:ascii="Calibri" w:hAnsi="Calibri"/>
+                <w:b/>
+                <w:i w:val="0"/>
+                <w:color w:val="163147"/>
+                <w:sz w:val="19"/>
+              </w:rPr>
+              <w:t>Sunspore</w:t>
+            </w:r>
+          </w:p>
+          <w:p>
+            <w:pPr>
+              <w:spacing w:after="0"/>
+            </w:pPr>
+            <w:r>
+              <w:rPr>
+                <w:rFonts w:ascii="Calibri" w:hAnsi="Calibri"/>
+                <w:b w:val="0"/>
+                <w:i/>
+                <w:color w:val="606973"/>
+                <w:sz w:val="16"/>
+              </w:rPr>
+              <w:t>Standalone</w:t>
+            </w:r>
+          </w:p>
+        </w:tc>
+        <w:tc>
+          <w:tcPr>
+            <w:tcW w:type="dxa" w:w="1250"/>
+            <w:vAlign w:val="center"/>
+            <w:tcMar>
+              <w:top w:w="80" w:type="dxa"/>
+              <w:start w:w="120" w:type="dxa"/>
+              <w:bottom w:w="80" w:type="dxa"/>
+              <w:end w:w="120" w:type="dxa"/>
+            </w:tcMar>
+          </w:tcPr>
+          <w:p>
+            <w:pPr>
+              <w:spacing w:after="0"/>
+              <w:jc w:val="center"/>
+            </w:pPr>
+            <w:r>
+              <w:rPr>
+                <w:rFonts w:ascii="Calibri" w:hAnsi="Calibri"/>
+                <w:b/>
+                <w:i w:val="0"/>
+                <w:color w:val="163147"/>
+                <w:sz w:val="17"/>
+              </w:rPr>
+              <w:t>Grass / Fire</w:t>
+            </w:r>
+          </w:p>
+        </w:tc>
+        <w:tc>
+          <w:tcPr>
+            <w:tcW w:type="dxa" w:w="850"/>
+            <w:vAlign w:val="center"/>
+            <w:tcMar>
+              <w:top w:w="80" w:type="dxa"/>
+              <w:start w:w="120" w:type="dxa"/>
+              <w:bottom w:w="80" w:type="dxa"/>
+              <w:end w:w="120" w:type="dxa"/>
+            </w:tcMar>
+          </w:tcPr>
+          <w:p>
+            <w:pPr>
+              <w:spacing w:after="0"/>
+              <w:jc w:val="center"/>
+            </w:pPr>
+            <w:r>
+              <w:rPr>
+                <w:rFonts w:ascii="Calibri" w:hAnsi="Calibri"/>
+                <w:b/>
+                <w:i w:val="0"/>
+                <w:color w:val="606973"/>
+                <w:sz w:val="17"/>
+              </w:rPr>
+              <w:t>Common</w:t>
+            </w:r>
+          </w:p>
+        </w:tc>
+        <w:tc>
+          <w:tcPr>
+            <w:tcW w:type="dxa" w:w="5330"/>
+            <w:vAlign w:val="center"/>
+            <w:tcMar>
+              <w:top w:w="80" w:type="dxa"/>
+              <w:start w:w="120" w:type="dxa"/>
+              <w:bottom w:w="80" w:type="dxa"/>
+              <w:end w:w="120" w:type="dxa"/>
+            </w:tcMar>
+          </w:tcPr>
+          <w:p>
+            <w:pPr>
+              <w:spacing w:after="0" w:line="259" w:lineRule="auto"/>
+            </w:pPr>
+            <w:r>
+              <w:rPr>
+                <w:rFonts w:ascii="Calibri" w:hAnsi="Calibri"/>
+                <w:b w:val="0"/>
+                <w:i w:val="0"/>
+                <w:color w:val="2D3237"/>
+                <w:sz w:val="17"/>
+              </w:rPr>
+              <w:t>A walking fungus with a warm golden cap and charcoal feet. It spreads only after controlled burns clear overcrowded undergrowth.</w:t>
+            </w:r>
+          </w:p>
+        </w:tc>
+      </w:tr>
+      <w:tr>
+        <w:tc>
+          <w:tcPr>
+            <w:tcW w:type="dxa" w:w="430"/>
+            <w:vAlign w:val="center"/>
+            <w:tcMar>
+              <w:top w:w="80" w:type="dxa"/>
+              <w:start w:w="120" w:type="dxa"/>
+              <w:bottom w:w="80" w:type="dxa"/>
+              <w:end w:w="120" w:type="dxa"/>
+            </w:tcMar>
+          </w:tcPr>
+          <w:p>
+            <w:pPr>
+              <w:spacing w:after="0"/>
+              <w:jc w:val="center"/>
+            </w:pPr>
+            <w:r>
+              <w:rPr>
+                <w:rFonts w:ascii="Calibri" w:hAnsi="Calibri"/>
+                <w:b/>
+                <w:i w:val="0"/>
+                <w:color w:val="606973"/>
+                <w:sz w:val="18"/>
+              </w:rPr>
+              <w:t>100</w:t>
+            </w:r>
+          </w:p>
+        </w:tc>
+        <w:tc>
+          <w:tcPr>
+            <w:tcW w:type="dxa" w:w="1500"/>
+            <w:vAlign w:val="center"/>
+            <w:tcMar>
+              <w:top w:w="80" w:type="dxa"/>
+              <w:start w:w="120" w:type="dxa"/>
+              <w:bottom w:w="80" w:type="dxa"/>
+              <w:end w:w="120" w:type="dxa"/>
+            </w:tcMar>
+          </w:tcPr>
+          <w:p>
+            <w:pPr>
+              <w:spacing w:after="20"/>
+            </w:pPr>
+            <w:r>
+              <w:rPr>
+                <w:rFonts w:ascii="Calibri" w:hAnsi="Calibri"/>
+                <w:b/>
+                <w:i w:val="0"/>
+                <w:color w:val="163147"/>
+                <w:sz w:val="19"/>
+              </w:rPr>
+              <w:t>Hollowmorrow</w:t>
+            </w:r>
+          </w:p>
+          <w:p>
+            <w:pPr>
+              <w:spacing w:after="0"/>
+            </w:pPr>
+            <w:r>
+              <w:rPr>
+                <w:rFonts w:ascii="Calibri" w:hAnsi="Calibri"/>
+                <w:b w:val="0"/>
+                <w:i/>
+                <w:color w:val="606973"/>
+                <w:sz w:val="16"/>
+              </w:rPr>
+              <w:t>Standalone</w:t>
+            </w:r>
+          </w:p>
+        </w:tc>
+        <w:tc>
+          <w:tcPr>
+            <w:tcW w:type="dxa" w:w="1250"/>
+            <w:vAlign w:val="center"/>
+            <w:tcMar>
+              <w:top w:w="80" w:type="dxa"/>
+              <w:start w:w="120" w:type="dxa"/>
+              <w:bottom w:w="80" w:type="dxa"/>
+              <w:end w:w="120" w:type="dxa"/>
+            </w:tcMar>
+          </w:tcPr>
+          <w:p>
+            <w:pPr>
+              <w:spacing w:after="0"/>
+              <w:jc w:val="center"/>
+            </w:pPr>
+            <w:r>
+              <w:rPr>
+                <w:rFonts w:ascii="Calibri" w:hAnsi="Calibri"/>
+                <w:b/>
+                <w:i w:val="0"/>
+                <w:color w:val="163147"/>
+                <w:sz w:val="17"/>
+              </w:rPr>
+              <w:t>Ghost / Normal</w:t>
+            </w:r>
+          </w:p>
+        </w:tc>
+        <w:tc>
+          <w:tcPr>
+            <w:tcW w:type="dxa" w:w="850"/>
+            <w:vAlign w:val="center"/>
+            <w:tcMar>
+              <w:top w:w="80" w:type="dxa"/>
+              <w:start w:w="120" w:type="dxa"/>
+              <w:bottom w:w="80" w:type="dxa"/>
+              <w:end w:w="120" w:type="dxa"/>
+            </w:tcMar>
+          </w:tcPr>
+          <w:p>
+            <w:pPr>
+              <w:spacing w:after="0"/>
+              <w:jc w:val="center"/>
+            </w:pPr>
+            <w:r>
+              <w:rPr>
+                <w:rFonts w:ascii="Calibri" w:hAnsi="Calibri"/>
+                <w:b/>
+                <w:i w:val="0"/>
+                <w:color w:val="7E4F18"/>
+                <w:sz w:val="17"/>
+              </w:rPr>
+              <w:t>Epic</w:t>
+            </w:r>
+          </w:p>
+        </w:tc>
+        <w:tc>
+          <w:tcPr>
+            <w:tcW w:type="dxa" w:w="5330"/>
+            <w:vAlign w:val="center"/>
+            <w:tcMar>
+              <w:top w:w="80" w:type="dxa"/>
+              <w:start w:w="120" w:type="dxa"/>
+              <w:bottom w:w="80" w:type="dxa"/>
+              <w:end w:w="120" w:type="dxa"/>
+            </w:tcMar>
+          </w:tcPr>
+          <w:p>
+            <w:pPr>
+              <w:spacing w:after="0" w:line="259" w:lineRule="auto"/>
+            </w:pPr>
+            <w:r>
+              <w:rPr>
+                <w:rFonts w:ascii="Calibri" w:hAnsi="Calibri"/>
+                <w:b w:val="0"/>
+                <w:i w:val="0"/>
+                <w:color w:val="2D3237"/>
+                <w:sz w:val="17"/>
+              </w:rPr>
+              <w:t>A pale featureless creature followed by echoes of movements it has not made yet. It appears shortly before major turning points.</w:t>
             </w:r>
           </w:p>
         </w:tc>

</xml_diff>